<commit_message>
Herschik document naar de fotovolgorde van het whiteboard
De hoofdstukken volgen nu de volgorde waarin de borden zijn
gefotografeerd (6, 7, 8, 9, 11, 13, 12, 15, 14, 16), verdeeld over drie
delen: het acute-zorgbord, het capaciteitsbord en het totaaloverzicht.

Twee nieuwe figuren: een schematische kaart per bord, met per blok een
verwijzing naar het hoofdstuk. De analyse van de acute poort en die van
de Hotfloor zijn gesplitst in twee losse hoofdstukken, omdat het twee
aparte foto's zijn. Onder elke hoofdstukkop staat naar welke foto het
hoofdstuk verwijst.

Co-Authored-By: Claude Opus 5 <noreply@anthropic.com>
Claude-Session: https://claude.ai/code/session_01MzaqydkWSKnpLkCvLiaavG
</commit_message>
<xml_diff>
--- a/docs/whiteboard/Integraal-Capaciteitsmanagement-whiteboard.docx
+++ b/docs/whiteboard/Integraal-Capaciteitsmanagement-whiteboard.docx
@@ -150,7 +150,7 @@
               <w:rPr>
                 <w:sz w:val="20"/>
               </w:rPr>
-              <w:t>Whiteboard 'Integraal Capaciteits Management' (10 foto's)</w:t>
+              <w:t>Whiteboard 'Integraal Capaciteits Management' (foto 6 t/m 16)</w:t>
             </w:r>
           </w:p>
         </w:tc>
@@ -294,62 +294,139 @@
           <w:color w:val="1B2430"/>
           <w:sz w:val="21"/>
         </w:rPr>
-        <w:t>Dit document zet de inhoud van het whiteboard om in negen samenhangende blokken. Elk blok bestaat uit een visualisatie en daaronder de letterlijke inhoud van het bord in tekst. De volgorde volgt de logica van de sessie: eerst het vertrekpunt en de planning, dan de situatieschets en de scenario's, en tot slot de openstaande vragen en het stappenplan.</w:t>
+        <w:t>De sessie is vastgelegd op twee whiteboards. Dit document volgt de volgorde waarin die borden zijn gefotografeerd: eerst het acute-zorgbord met de analyse, het stappenplan en de scenario's, daarna het capaciteitsbord met de tijdlijn en de plattegrond, en tot slot het totaaloverzicht.</w:t>
       </w:r>
     </w:p>
     <w:p>
       <w:pPr>
-        <w:spacing w:before="120" w:after="40"/>
-        <w:jc w:val="center"/>
+        <w:spacing w:before="0" w:after="120" w:line="300" w:lineRule="auto"/>
       </w:pPr>
       <w:r>
-        <w:drawing>
-          <wp:inline xmlns:a="http://schemas.openxmlformats.org/drawingml/2006/main" xmlns:pic="http://schemas.openxmlformats.org/drawingml/2006/picture">
-            <wp:extent cx="5903999" cy="3795428"/>
-            <wp:docPr id="1" name="Picture 1"/>
-            <wp:cNvGraphicFramePr>
-              <a:graphicFrameLocks noChangeAspect="1"/>
-            </wp:cNvGraphicFramePr>
-            <a:graphic>
-              <a:graphicData uri="http://schemas.openxmlformats.org/drawingml/2006/picture">
-                <pic:pic>
-                  <pic:nvPicPr>
-                    <pic:cNvPr id="0" name="fig01_overzicht.png"/>
-                    <pic:cNvPicPr/>
-                  </pic:nvPicPr>
-                  <pic:blipFill>
-                    <a:blip r:embed="rId10"/>
-                    <a:stretch>
-                      <a:fillRect/>
-                    </a:stretch>
-                  </pic:blipFill>
-                  <pic:spPr>
-                    <a:xfrm>
-                      <a:off x="0" y="0"/>
-                      <a:ext cx="5903999" cy="3795428"/>
-                    </a:xfrm>
-                    <a:prstGeom prst="rect"/>
-                  </pic:spPr>
-                </pic:pic>
-              </a:graphicData>
-            </a:graphic>
-          </wp:inline>
-        </w:drawing>
+        <w:rPr>
+          <w:b w:val="0"/>
+          <w:i w:val="0"/>
+          <w:color w:val="1B2430"/>
+          <w:sz w:val="21"/>
+        </w:rPr>
+        <w:t>Elk hoofdstuk bestaat uit een visualisatie en daaronder de inhoud van het bord in tekst. Onder elke hoofdstuktitel staat naar welke foto het hoofdstuk verwijst.</w:t>
       </w:r>
     </w:p>
+    <w:tbl>
+      <w:tblPr>
+        <w:tblW w:type="auto" w:w="0"/>
+        <w:jc w:val="center"/>
+        <w:tblBorders>
+          <w:top w:val="single" w:sz="4" w:space="0" w:color="D6DCE5"/>
+          <w:left w:val="single" w:sz="4" w:space="0" w:color="D6DCE5"/>
+          <w:bottom w:val="single" w:sz="4" w:space="0" w:color="D6DCE5"/>
+          <w:right w:val="single" w:sz="4" w:space="0" w:color="D6DCE5"/>
+          <w:insideH w:val="single" w:sz="4" w:space="0" w:color="D6DCE5"/>
+          <w:insideV w:val="single" w:sz="4" w:space="0" w:color="D6DCE5"/>
+        </w:tblBorders>
+        <w:tblLook w:firstColumn="1" w:firstRow="1" w:lastColumn="0" w:lastRow="0" w:noHBand="0" w:noVBand="1" w:val="04A0"/>
+      </w:tblPr>
+      <w:tblGrid>
+        <w:gridCol w:w="4649"/>
+        <w:gridCol w:w="4649"/>
+      </w:tblGrid>
+      <w:tr>
+        <w:tc>
+          <w:tcPr>
+            <w:tcW w:type="dxa" w:w="3628"/>
+            <w:shd w:val="clear" w:color="auto" w:fill="F2F4F7"/>
+          </w:tcPr>
+          <w:p>
+            <w:r>
+              <w:rPr>
+                <w:b/>
+                <w:color w:val="1F5FA8"/>
+                <w:sz w:val="20"/>
+              </w:rPr>
+              <w:t>DEEL A - Het acute-zorgbord</w:t>
+            </w:r>
+          </w:p>
+        </w:tc>
+        <w:tc>
+          <w:tcPr>
+            <w:tcW w:type="dxa" w:w="5669"/>
+          </w:tcPr>
+          <w:p>
+            <w:r>
+              <w:rPr>
+                <w:sz w:val="20"/>
+              </w:rPr>
+              <w:t>hoofdstuk 1 t/m 7   (foto 6, 7, 8, 9, 11, 13, 12)</w:t>
+            </w:r>
+          </w:p>
+        </w:tc>
+      </w:tr>
+      <w:tr>
+        <w:tc>
+          <w:tcPr>
+            <w:tcW w:type="dxa" w:w="3628"/>
+            <w:shd w:val="clear" w:color="auto" w:fill="F2F4F7"/>
+          </w:tcPr>
+          <w:p>
+            <w:r>
+              <w:rPr>
+                <w:b/>
+                <w:color w:val="1F5FA8"/>
+                <w:sz w:val="20"/>
+              </w:rPr>
+              <w:t>DEEL B - Het capaciteitsbord</w:t>
+            </w:r>
+          </w:p>
+        </w:tc>
+        <w:tc>
+          <w:tcPr>
+            <w:tcW w:type="dxa" w:w="5669"/>
+          </w:tcPr>
+          <w:p>
+            <w:r>
+              <w:rPr>
+                <w:sz w:val="20"/>
+              </w:rPr>
+              <w:t>hoofdstuk 8 en 9   (foto 15, 14)</w:t>
+            </w:r>
+          </w:p>
+        </w:tc>
+      </w:tr>
+      <w:tr>
+        <w:tc>
+          <w:tcPr>
+            <w:tcW w:type="dxa" w:w="3628"/>
+            <w:shd w:val="clear" w:color="auto" w:fill="F2F4F7"/>
+          </w:tcPr>
+          <w:p>
+            <w:r>
+              <w:rPr>
+                <w:b/>
+                <w:color w:val="1F5FA8"/>
+                <w:sz w:val="20"/>
+              </w:rPr>
+              <w:t>DEEL C - Totaaloverzicht</w:t>
+            </w:r>
+          </w:p>
+        </w:tc>
+        <w:tc>
+          <w:tcPr>
+            <w:tcW w:type="dxa" w:w="5669"/>
+          </w:tcPr>
+          <w:p>
+            <w:r>
+              <w:rPr>
+                <w:sz w:val="20"/>
+              </w:rPr>
+              <w:t>hoofdstuk 10   (foto 16)</w:t>
+            </w:r>
+          </w:p>
+        </w:tc>
+      </w:tr>
+    </w:tbl>
     <w:p>
       <w:pPr>
-        <w:spacing w:after="240"/>
-        <w:jc w:val="center"/>
-      </w:pPr>
-      <w:r>
-        <w:rPr>
-          <w:i/>
-          <w:color w:val="5A6472"/>
-          <w:sz w:val="18"/>
-        </w:rPr>
-        <w:t>Figuur 1 - Opbouw van het whiteboard in negen blokken</w:t>
-      </w:r>
+        <w:spacing w:before="0" w:after="120" w:line="300" w:lineRule="auto"/>
+      </w:pPr>
     </w:p>
     <w:tbl>
       <w:tblPr>
@@ -508,6 +585,65 @@
         <w:br w:type="page"/>
       </w:r>
     </w:p>
+    <w:tbl>
+      <w:tblPr>
+        <w:tblW w:type="auto" w:w="0"/>
+        <w:jc w:val="center"/>
+        <w:tblBorders>
+          <w:top w:val="single" w:sz="4" w:space="0" w:color="1F5FA8"/>
+          <w:left w:val="single" w:sz="4" w:space="0" w:color="1F5FA8"/>
+          <w:bottom w:val="single" w:sz="4" w:space="0" w:color="1F5FA8"/>
+          <w:right w:val="single" w:sz="4" w:space="0" w:color="1F5FA8"/>
+          <w:insideH w:val="single" w:sz="4" w:space="0" w:color="1F5FA8"/>
+          <w:insideV w:val="single" w:sz="4" w:space="0" w:color="1F5FA8"/>
+        </w:tblBorders>
+        <w:tblLook w:firstColumn="1" w:firstRow="1" w:lastColumn="0" w:lastRow="0" w:noHBand="0" w:noVBand="1" w:val="04A0"/>
+      </w:tblPr>
+      <w:tblGrid>
+        <w:gridCol w:w="9298"/>
+      </w:tblGrid>
+      <w:tr>
+        <w:tc>
+          <w:tcPr>
+            <w:tcW w:type="dxa" w:w="9298"/>
+            <w:shd w:val="clear" w:color="auto" w:fill="1F5FA8"/>
+          </w:tcPr>
+          <w:p>
+            <w:pPr>
+              <w:spacing w:before="120" w:after="40"/>
+              <w:jc w:val="center"/>
+            </w:pPr>
+            <w:r>
+              <w:rPr>
+                <w:b/>
+                <w:color w:val="FFFFFF"/>
+                <w:sz w:val="22"/>
+              </w:rPr>
+              <w:t>DEEL A</w:t>
+            </w:r>
+          </w:p>
+          <w:p>
+            <w:pPr>
+              <w:spacing w:after="120"/>
+              <w:jc w:val="center"/>
+            </w:pPr>
+            <w:r>
+              <w:rPr>
+                <w:b/>
+                <w:color w:val="FFFFFF"/>
+                <w:sz w:val="32"/>
+              </w:rPr>
+              <w:t>Het acute-zorgbord</w:t>
+            </w:r>
+          </w:p>
+        </w:tc>
+      </w:tr>
+    </w:tbl>
+    <w:p>
+      <w:pPr>
+        <w:spacing w:after="40"/>
+      </w:pPr>
+    </w:p>
     <w:p>
       <w:pPr>
         <w:pStyle w:val="Heading1"/>
@@ -522,7 +658,20 @@
           <w:color w:val="1F5FA8"/>
           <w:sz w:val="34"/>
         </w:rPr>
-        <w:t>1. Vertrekpunt en planning</w:t>
+        <w:t>1. Overzicht van het acute-zorgbord</w:t>
+      </w:r>
+    </w:p>
+    <w:p>
+      <w:pPr>
+        <w:spacing w:before="0" w:after="160"/>
+      </w:pPr>
+      <w:r>
+        <w:rPr>
+          <w:i/>
+          <w:color w:val="5A6472"/>
+          <w:sz w:val="18"/>
+        </w:rPr>
+        <w:t>Foto 6 - het hele bord in een opname</w:t>
       </w:r>
     </w:p>
     <w:p>
@@ -536,7 +685,1091 @@
           <w:color w:val="1B2430"/>
           <w:sz w:val="21"/>
         </w:rPr>
-        <w:t>Het bord begint bij de planning. Er zijn vier perioden te onderscheiden, en per periode is de vraag anders: wat kan er nu al, wat kan pas in de oudbouw, en wat kan pas na de verhuizing?</w:t>
+        <w:t>Het acute-zorgbord bevat negen blokken. Ze horen bij elkaar: links staat wat er gepland is en welke scenario's er zijn, in het midden de verandering van oud naar nieuw en het stappenplan, en rechts de analyse van de twee grote wijzigingen.</w:t>
+      </w:r>
+    </w:p>
+    <w:p>
+      <w:pPr>
+        <w:spacing w:before="120" w:after="40"/>
+        <w:jc w:val="center"/>
+      </w:pPr>
+      <w:r>
+        <w:drawing>
+          <wp:inline xmlns:a="http://schemas.openxmlformats.org/drawingml/2006/main" xmlns:pic="http://schemas.openxmlformats.org/drawingml/2006/picture">
+            <wp:extent cx="5903999" cy="3795428"/>
+            <wp:docPr id="1" name="Picture 1"/>
+            <wp:cNvGraphicFramePr>
+              <a:graphicFrameLocks noChangeAspect="1"/>
+            </wp:cNvGraphicFramePr>
+            <a:graphic>
+              <a:graphicData uri="http://schemas.openxmlformats.org/drawingml/2006/picture">
+                <pic:pic>
+                  <pic:nvPicPr>
+                    <pic:cNvPr id="0" name="fig_bordoverzicht.png"/>
+                    <pic:cNvPicPr/>
+                  </pic:nvPicPr>
+                  <pic:blipFill>
+                    <a:blip r:embed="rId10"/>
+                    <a:stretch>
+                      <a:fillRect/>
+                    </a:stretch>
+                  </pic:blipFill>
+                  <pic:spPr>
+                    <a:xfrm>
+                      <a:off x="0" y="0"/>
+                      <a:ext cx="5903999" cy="3795428"/>
+                    </a:xfrm>
+                    <a:prstGeom prst="rect"/>
+                  </pic:spPr>
+                </pic:pic>
+              </a:graphicData>
+            </a:graphic>
+          </wp:inline>
+        </w:drawing>
+      </w:r>
+    </w:p>
+    <w:p>
+      <w:pPr>
+        <w:spacing w:after="240"/>
+        <w:jc w:val="center"/>
+      </w:pPr>
+      <w:r>
+        <w:rPr>
+          <w:i/>
+          <w:color w:val="5A6472"/>
+          <w:sz w:val="18"/>
+        </w:rPr>
+        <w:t>Figuur 1 - Schematische kaart van het acute-zorgbord, met de hoofdstukken erbij</w:t>
+      </w:r>
+    </w:p>
+    <w:p>
+      <w:pPr>
+        <w:pStyle w:val="Heading2"/>
+        <w:spacing w:before="240" w:after="120"/>
+      </w:pPr>
+      <w:r>
+        <w:rPr>
+          <w:rFonts w:ascii="Calibri" w:hAnsi="Calibri"/>
+          <w:color w:val="1F5FA8"/>
+          <w:sz w:val="26"/>
+        </w:rPr>
+        <w:t>Hoe de blokken samenhangen</w:t>
+      </w:r>
+    </w:p>
+    <w:p>
+      <w:pPr>
+        <w:pStyle w:val="ListBullet"/>
+        <w:spacing w:after="60" w:line="288" w:lineRule="auto"/>
+      </w:pPr>
+      <w:r>
+        <w:rPr>
+          <w:color w:val="1B2430"/>
+          <w:sz w:val="21"/>
+        </w:rPr>
+        <w:t>Rechts staat de conclusie: de acute poort past niet, de Hotfloor past wel (hoofdstuk 2 en 3).</w:t>
+      </w:r>
+    </w:p>
+    <w:p>
+      <w:pPr>
+        <w:pStyle w:val="ListBullet"/>
+        <w:spacing w:after="60" w:line="288" w:lineRule="auto"/>
+      </w:pPr>
+      <w:r>
+        <w:rPr>
+          <w:color w:val="1B2430"/>
+          <w:sz w:val="21"/>
+        </w:rPr>
+        <w:t>In het midden staat hoe je van daaruit verder komt: het stappenplan (hoofdstuk 4).</w:t>
+      </w:r>
+    </w:p>
+    <w:p>
+      <w:pPr>
+        <w:pStyle w:val="ListBullet"/>
+        <w:spacing w:after="60" w:line="288" w:lineRule="auto"/>
+      </w:pPr>
+      <w:r>
+        <w:rPr>
+          <w:color w:val="1B2430"/>
+          <w:sz w:val="21"/>
+        </w:rPr>
+        <w:t>Links staat wat er nog open is en welke scenario's er liggen (hoofdstuk 5 en 6).</w:t>
+      </w:r>
+    </w:p>
+    <w:p>
+      <w:r>
+        <w:br w:type="page"/>
+      </w:r>
+    </w:p>
+    <w:p>
+      <w:pPr>
+        <w:pStyle w:val="Heading1"/>
+        <w:pBdr>
+          <w:bottom w:val="single" w:sz="6" w:space="4" w:color="1F5FA8"/>
+        </w:pBdr>
+        <w:spacing w:before="360" w:after="120"/>
+      </w:pPr>
+      <w:r>
+        <w:rPr>
+          <w:rFonts w:ascii="Calibri" w:hAnsi="Calibri"/>
+          <w:color w:val="1F5FA8"/>
+          <w:sz w:val="34"/>
+        </w:rPr>
+        <w:t>2. Analyse: past de acute poort?</w:t>
+      </w:r>
+    </w:p>
+    <w:p>
+      <w:pPr>
+        <w:spacing w:before="0" w:after="160"/>
+      </w:pPr>
+      <w:r>
+        <w:rPr>
+          <w:i/>
+          <w:color w:val="5A6472"/>
+          <w:sz w:val="18"/>
+        </w:rPr>
+        <w:t>Foto 7 - rechterkolom van het bord, bovenste deel</w:t>
+      </w:r>
+    </w:p>
+    <w:p>
+      <w:pPr>
+        <w:spacing w:before="0" w:after="120" w:line="300" w:lineRule="auto"/>
+      </w:pPr>
+      <w:r>
+        <w:rPr>
+          <w:b w:val="0"/>
+          <w:i w:val="0"/>
+          <w:color w:val="1B2430"/>
+          <w:sz w:val="21"/>
+        </w:rPr>
+        <w:t>De eerste grote wijziging is de acute poort: kind spoed, EHH en SEH komen samen achter een poort. De analyse laat zien dat dit in de huidige opzet niet past.</w:t>
+      </w:r>
+    </w:p>
+    <w:p>
+      <w:pPr>
+        <w:spacing w:before="120" w:after="40"/>
+        <w:jc w:val="center"/>
+      </w:pPr>
+      <w:r>
+        <w:drawing>
+          <wp:inline xmlns:a="http://schemas.openxmlformats.org/drawingml/2006/main" xmlns:pic="http://schemas.openxmlformats.org/drawingml/2006/picture">
+            <wp:extent cx="5903999" cy="3500228"/>
+            <wp:docPr id="2" name="Picture 2"/>
+            <wp:cNvGraphicFramePr>
+              <a:graphicFrameLocks noChangeAspect="1"/>
+            </wp:cNvGraphicFramePr>
+            <a:graphic>
+              <a:graphicData uri="http://schemas.openxmlformats.org/drawingml/2006/picture">
+                <pic:pic>
+                  <pic:nvPicPr>
+                    <pic:cNvPr id="0" name="fig_acutepoort.png"/>
+                    <pic:cNvPicPr/>
+                  </pic:nvPicPr>
+                  <pic:blipFill>
+                    <a:blip r:embed="rId11"/>
+                    <a:stretch>
+                      <a:fillRect/>
+                    </a:stretch>
+                  </pic:blipFill>
+                  <pic:spPr>
+                    <a:xfrm>
+                      <a:off x="0" y="0"/>
+                      <a:ext cx="5903999" cy="3500228"/>
+                    </a:xfrm>
+                    <a:prstGeom prst="rect"/>
+                  </pic:spPr>
+                </pic:pic>
+              </a:graphicData>
+            </a:graphic>
+          </wp:inline>
+        </w:drawing>
+      </w:r>
+    </w:p>
+    <w:p>
+      <w:pPr>
+        <w:spacing w:after="240"/>
+        <w:jc w:val="center"/>
+      </w:pPr>
+      <w:r>
+        <w:rPr>
+          <w:i/>
+          <w:color w:val="5A6472"/>
+          <w:sz w:val="18"/>
+        </w:rPr>
+        <w:t>Figuur 2 - Analyse van de acute poort en het doel dat eronder ligt</w:t>
+      </w:r>
+    </w:p>
+    <w:p>
+      <w:pPr>
+        <w:pStyle w:val="Heading2"/>
+        <w:spacing w:before="240" w:after="120"/>
+      </w:pPr>
+      <w:r>
+        <w:rPr>
+          <w:rFonts w:ascii="Calibri" w:hAnsi="Calibri"/>
+          <w:color w:val="1F5FA8"/>
+          <w:sz w:val="26"/>
+        </w:rPr>
+        <w:t>Wat staat er op het bord</w:t>
+      </w:r>
+    </w:p>
+    <w:p>
+      <w:pPr>
+        <w:pStyle w:val="ListBullet"/>
+        <w:spacing w:after="60" w:line="288" w:lineRule="auto"/>
+      </w:pPr>
+      <w:r>
+        <w:rPr>
+          <w:color w:val="1B2430"/>
+          <w:sz w:val="21"/>
+        </w:rPr>
+        <w:t>1 acute poort past niet voor kind, EHH en SEH samen.</w:t>
+      </w:r>
+    </w:p>
+    <w:p>
+      <w:pPr>
+        <w:pStyle w:val="ListBullet"/>
+        <w:spacing w:after="60" w:line="288" w:lineRule="auto"/>
+      </w:pPr>
+      <w:r>
+        <w:rPr>
+          <w:color w:val="1B2430"/>
+          <w:sz w:val="21"/>
+        </w:rPr>
+        <w:t>Analyse op dag- en uurniveau.</w:t>
+      </w:r>
+    </w:p>
+    <w:p>
+      <w:pPr>
+        <w:pStyle w:val="ListBullet"/>
+        <w:spacing w:after="60" w:line="288" w:lineRule="auto"/>
+      </w:pPr>
+      <w:r>
+        <w:rPr>
+          <w:color w:val="1B2430"/>
+          <w:sz w:val="21"/>
+        </w:rPr>
+        <w:t>Jaarpatroon in beeld brengen.</w:t>
+      </w:r>
+    </w:p>
+    <w:p>
+      <w:pPr>
+        <w:pStyle w:val="ListBullet"/>
+        <w:spacing w:after="60" w:line="288" w:lineRule="auto"/>
+      </w:pPr>
+      <w:r>
+        <w:rPr>
+          <w:color w:val="1B2430"/>
+          <w:sz w:val="21"/>
+        </w:rPr>
+        <w:t>Data is beschikbaar; vervolgactie bepalen.</w:t>
+      </w:r>
+    </w:p>
+    <w:p>
+      <w:pPr>
+        <w:pStyle w:val="ListBullet"/>
+        <w:spacing w:after="60" w:line="288" w:lineRule="auto"/>
+      </w:pPr>
+      <w:r>
+        <w:rPr>
+          <w:color w:val="1B2430"/>
+          <w:sz w:val="21"/>
+        </w:rPr>
+        <w:t>Doel: de zorg past fysiek op de nieuwe SEH.</w:t>
+      </w:r>
+    </w:p>
+    <w:p>
+      <w:pPr>
+        <w:pStyle w:val="ListBullet"/>
+        <w:spacing w:after="60" w:line="288" w:lineRule="auto"/>
+      </w:pPr>
+      <w:r>
+        <w:rPr>
+          <w:color w:val="1B2430"/>
+          <w:sz w:val="21"/>
+        </w:rPr>
+        <w:t>Fysieke plekken: hoeveel plekken zijn er nodig?</w:t>
+      </w:r>
+    </w:p>
+    <w:p>
+      <w:r>
+        <w:br w:type="page"/>
+      </w:r>
+    </w:p>
+    <w:p>
+      <w:pPr>
+        <w:pStyle w:val="Heading1"/>
+        <w:pBdr>
+          <w:bottom w:val="single" w:sz="6" w:space="4" w:color="0E9A87"/>
+        </w:pBdr>
+        <w:spacing w:before="360" w:after="120"/>
+      </w:pPr>
+      <w:r>
+        <w:rPr>
+          <w:rFonts w:ascii="Calibri" w:hAnsi="Calibri"/>
+          <w:color w:val="0E9A87"/>
+          <w:sz w:val="34"/>
+        </w:rPr>
+        <w:t>3. Analyse: past de Hotfloor? En waar valt de EHH onder?</w:t>
+      </w:r>
+    </w:p>
+    <w:p>
+      <w:pPr>
+        <w:spacing w:before="0" w:after="160"/>
+      </w:pPr>
+      <w:r>
+        <w:rPr>
+          <w:i/>
+          <w:color w:val="5A6472"/>
+          <w:sz w:val="18"/>
+        </w:rPr>
+        <w:t>Foto 8 - rechterkolom van het bord, onderste deel</w:t>
+      </w:r>
+    </w:p>
+    <w:p>
+      <w:pPr>
+        <w:spacing w:before="0" w:after="120" w:line="300" w:lineRule="auto"/>
+      </w:pPr>
+      <w:r>
+        <w:rPr>
+          <w:b w:val="0"/>
+          <w:i w:val="0"/>
+          <w:color w:val="1B2430"/>
+          <w:sz w:val="21"/>
+        </w:rPr>
+        <w:t>De tweede grote wijziging is de Hotfloor: ICU, CCU en SCU samen. Deze analyse valt anders uit dan die van de acute poort. Onderaan het bord staat de vraag die beide wijzigingen raakt: waar valt de EHH onder?</w:t>
+      </w:r>
+    </w:p>
+    <w:p>
+      <w:pPr>
+        <w:spacing w:before="120" w:after="40"/>
+        <w:jc w:val="center"/>
+      </w:pPr>
+      <w:r>
+        <w:drawing>
+          <wp:inline xmlns:a="http://schemas.openxmlformats.org/drawingml/2006/main" xmlns:pic="http://schemas.openxmlformats.org/drawingml/2006/picture">
+            <wp:extent cx="5903999" cy="4217142"/>
+            <wp:docPr id="3" name="Picture 3"/>
+            <wp:cNvGraphicFramePr>
+              <a:graphicFrameLocks noChangeAspect="1"/>
+            </wp:cNvGraphicFramePr>
+            <a:graphic>
+              <a:graphicData uri="http://schemas.openxmlformats.org/drawingml/2006/picture">
+                <pic:pic>
+                  <pic:nvPicPr>
+                    <pic:cNvPr id="0" name="fig_hotfloor.png"/>
+                    <pic:cNvPicPr/>
+                  </pic:nvPicPr>
+                  <pic:blipFill>
+                    <a:blip r:embed="rId12"/>
+                    <a:stretch>
+                      <a:fillRect/>
+                    </a:stretch>
+                  </pic:blipFill>
+                  <pic:spPr>
+                    <a:xfrm>
+                      <a:off x="0" y="0"/>
+                      <a:ext cx="5903999" cy="4217142"/>
+                    </a:xfrm>
+                    <a:prstGeom prst="rect"/>
+                  </pic:spPr>
+                </pic:pic>
+              </a:graphicData>
+            </a:graphic>
+          </wp:inline>
+        </w:drawing>
+      </w:r>
+    </w:p>
+    <w:p>
+      <w:pPr>
+        <w:spacing w:after="240"/>
+        <w:jc w:val="center"/>
+      </w:pPr>
+      <w:r>
+        <w:rPr>
+          <w:i/>
+          <w:color w:val="5A6472"/>
+          <w:sz w:val="18"/>
+        </w:rPr>
+        <w:t>Figuur 3 - Analyse van de Hotfloor en de EHH-vraag die beide wijzigingen raakt</w:t>
+      </w:r>
+    </w:p>
+    <w:p>
+      <w:pPr>
+        <w:pStyle w:val="Heading2"/>
+        <w:spacing w:before="240" w:after="120"/>
+      </w:pPr>
+      <w:r>
+        <w:rPr>
+          <w:rFonts w:ascii="Calibri" w:hAnsi="Calibri"/>
+          <w:color w:val="0E9A87"/>
+          <w:sz w:val="26"/>
+        </w:rPr>
+        <w:t>Wat staat er op het bord</w:t>
+      </w:r>
+    </w:p>
+    <w:p>
+      <w:pPr>
+        <w:pStyle w:val="ListBullet"/>
+        <w:spacing w:after="60" w:line="288" w:lineRule="auto"/>
+      </w:pPr>
+      <w:r>
+        <w:rPr>
+          <w:color w:val="1B2430"/>
+          <w:sz w:val="21"/>
+        </w:rPr>
+        <w:t>Hotfloor op 16 bedden past wel.</w:t>
+      </w:r>
+    </w:p>
+    <w:p>
+      <w:pPr>
+        <w:pStyle w:val="ListBullet"/>
+        <w:spacing w:after="60" w:line="288" w:lineRule="auto"/>
+      </w:pPr>
+      <w:r>
+        <w:rPr>
+          <w:color w:val="1B2430"/>
+          <w:sz w:val="21"/>
+        </w:rPr>
+        <w:t>Openstaand: wat is de weigeringskans?</w:t>
+      </w:r>
+    </w:p>
+    <w:p>
+      <w:pPr>
+        <w:pStyle w:val="ListBullet"/>
+        <w:spacing w:after="60" w:line="288" w:lineRule="auto"/>
+      </w:pPr>
+      <w:r>
+        <w:rPr>
+          <w:color w:val="1B2430"/>
+          <w:sz w:val="21"/>
+        </w:rPr>
+        <w:t>Openstaand: komt de EHH er apart bij?</w:t>
+      </w:r>
+    </w:p>
+    <w:p>
+      <w:pPr>
+        <w:pStyle w:val="ListBullet"/>
+        <w:spacing w:after="60" w:line="288" w:lineRule="auto"/>
+      </w:pPr>
+      <w:r>
+        <w:rPr>
+          <w:color w:val="1B2430"/>
+          <w:sz w:val="21"/>
+        </w:rPr>
+        <w:t>2 grote wijzigingen: (1) acute poort, drie stromen naar een poort; (2) Hotfloor, ICU/CCU/SCU samen.</w:t>
+      </w:r>
+    </w:p>
+    <w:p>
+      <w:pPr>
+        <w:pStyle w:val="ListBullet"/>
+        <w:spacing w:after="60" w:line="288" w:lineRule="auto"/>
+      </w:pPr>
+      <w:r>
+        <w:rPr>
+          <w:color w:val="1B2430"/>
+          <w:sz w:val="21"/>
+        </w:rPr>
+        <w:t>Waar valt de EHH onder, bij 1 of bij 2? Daaruit volgen analyse, knelpunten en acties.</w:t>
+      </w:r>
+    </w:p>
+    <w:p>
+      <w:r>
+        <w:br w:type="page"/>
+      </w:r>
+    </w:p>
+    <w:p>
+      <w:pPr>
+        <w:pStyle w:val="Heading1"/>
+        <w:pBdr>
+          <w:bottom w:val="single" w:sz="6" w:space="4" w:color="6B3FA0"/>
+        </w:pBdr>
+        <w:spacing w:before="360" w:after="120"/>
+      </w:pPr>
+      <w:r>
+        <w:rPr>
+          <w:rFonts w:ascii="Calibri" w:hAnsi="Calibri"/>
+          <w:color w:val="6B3FA0"/>
+          <w:sz w:val="34"/>
+        </w:rPr>
+        <w:t>4. Stappenplan</w:t>
+      </w:r>
+    </w:p>
+    <w:p>
+      <w:pPr>
+        <w:spacing w:before="0" w:after="160"/>
+      </w:pPr>
+      <w:r>
+        <w:rPr>
+          <w:i/>
+          <w:color w:val="5A6472"/>
+          <w:sz w:val="18"/>
+        </w:rPr>
+        <w:t>Foto 9 - middendeel van het bord</w:t>
+      </w:r>
+    </w:p>
+    <w:p>
+      <w:pPr>
+        <w:spacing w:before="0" w:after="120" w:line="300" w:lineRule="auto"/>
+      </w:pPr>
+      <w:r>
+        <w:rPr>
+          <w:b w:val="0"/>
+          <w:i w:val="0"/>
+          <w:color w:val="1B2430"/>
+          <w:sz w:val="21"/>
+        </w:rPr>
+        <w:t>Het stappenplan is de rode draad van het bord: het laat zien hoe je van een scenario komt tot een rooster dat klopt, en hoe je daarna blijft monitoren.</w:t>
+      </w:r>
+    </w:p>
+    <w:p>
+      <w:pPr>
+        <w:spacing w:before="120" w:after="40"/>
+        <w:jc w:val="center"/>
+      </w:pPr>
+      <w:r>
+        <w:drawing>
+          <wp:inline xmlns:a="http://schemas.openxmlformats.org/drawingml/2006/main" xmlns:pic="http://schemas.openxmlformats.org/drawingml/2006/picture">
+            <wp:extent cx="5903999" cy="4554514"/>
+            <wp:docPr id="4" name="Picture 4"/>
+            <wp:cNvGraphicFramePr>
+              <a:graphicFrameLocks noChangeAspect="1"/>
+            </wp:cNvGraphicFramePr>
+            <a:graphic>
+              <a:graphicData uri="http://schemas.openxmlformats.org/drawingml/2006/picture">
+                <pic:pic>
+                  <pic:nvPicPr>
+                    <pic:cNvPr id="0" name="fig10_stappenplan.png"/>
+                    <pic:cNvPicPr/>
+                  </pic:nvPicPr>
+                  <pic:blipFill>
+                    <a:blip r:embed="rId13"/>
+                    <a:stretch>
+                      <a:fillRect/>
+                    </a:stretch>
+                  </pic:blipFill>
+                  <pic:spPr>
+                    <a:xfrm>
+                      <a:off x="0" y="0"/>
+                      <a:ext cx="5903999" cy="4554514"/>
+                    </a:xfrm>
+                    <a:prstGeom prst="rect"/>
+                  </pic:spPr>
+                </pic:pic>
+              </a:graphicData>
+            </a:graphic>
+          </wp:inline>
+        </w:drawing>
+      </w:r>
+    </w:p>
+    <w:p>
+      <w:pPr>
+        <w:spacing w:after="240"/>
+        <w:jc w:val="center"/>
+      </w:pPr>
+      <w:r>
+        <w:rPr>
+          <w:i/>
+          <w:color w:val="5A6472"/>
+          <w:sz w:val="18"/>
+        </w:rPr>
+        <w:t>Figuur 4 - Stappenplan van scenario naar roostersleutel, planning en monitoring</w:t>
+      </w:r>
+    </w:p>
+    <w:p>
+      <w:pPr>
+        <w:pStyle w:val="Heading2"/>
+        <w:spacing w:before="240" w:after="120"/>
+      </w:pPr>
+      <w:r>
+        <w:rPr>
+          <w:rFonts w:ascii="Calibri" w:hAnsi="Calibri"/>
+          <w:color w:val="6B3FA0"/>
+          <w:sz w:val="26"/>
+        </w:rPr>
+        <w:t>De stappen</w:t>
+      </w:r>
+    </w:p>
+    <w:p>
+      <w:pPr>
+        <w:pStyle w:val="ListNumber"/>
+        <w:spacing w:after="60" w:line="288" w:lineRule="auto"/>
+      </w:pPr>
+      <w:r>
+        <w:rPr>
+          <w:color w:val="1B2430"/>
+          <w:sz w:val="21"/>
+        </w:rPr>
+        <w:t>Scenario's uitwerken.</w:t>
+      </w:r>
+    </w:p>
+    <w:p>
+      <w:pPr>
+        <w:pStyle w:val="ListNumber"/>
+        <w:spacing w:after="60" w:line="288" w:lineRule="auto"/>
+      </w:pPr>
+      <w:r>
+        <w:rPr>
+          <w:color w:val="1B2430"/>
+          <w:sz w:val="21"/>
+        </w:rPr>
+        <w:t>Keuze maken op basis van data uit BI.</w:t>
+      </w:r>
+    </w:p>
+    <w:p>
+      <w:pPr>
+        <w:pStyle w:val="ListNumber"/>
+        <w:spacing w:after="60" w:line="288" w:lineRule="auto"/>
+      </w:pPr>
+      <w:r>
+        <w:rPr>
+          <w:color w:val="1B2430"/>
+          <w:sz w:val="21"/>
+        </w:rPr>
+        <w:t>Uitwerken in een week- en dagplan.</w:t>
+      </w:r>
+    </w:p>
+    <w:p>
+      <w:pPr>
+        <w:pStyle w:val="ListNumber"/>
+        <w:spacing w:after="60" w:line="288" w:lineRule="auto"/>
+      </w:pPr>
+      <w:r>
+        <w:rPr>
+          <w:color w:val="1B2430"/>
+          <w:sz w:val="21"/>
+        </w:rPr>
+        <w:t>Verwerken in de roostersleutels.</w:t>
+      </w:r>
+    </w:p>
+    <w:p>
+      <w:pPr>
+        <w:pStyle w:val="ListNumber"/>
+        <w:spacing w:after="60" w:line="288" w:lineRule="auto"/>
+      </w:pPr>
+      <w:r>
+        <w:rPr>
+          <w:color w:val="1B2430"/>
+          <w:sz w:val="21"/>
+        </w:rPr>
+        <w:t>Planning CPP.</w:t>
+      </w:r>
+    </w:p>
+    <w:p>
+      <w:pPr>
+        <w:pStyle w:val="ListNumber"/>
+        <w:spacing w:after="60" w:line="288" w:lineRule="auto"/>
+      </w:pPr>
+      <w:r>
+        <w:rPr>
+          <w:color w:val="1B2430"/>
+          <w:sz w:val="21"/>
+        </w:rPr>
+        <w:t>Monitoring van instroom, stops en knelpunten, en monitoring van de urenoverzichten.</w:t>
+      </w:r>
+    </w:p>
+    <w:p>
+      <w:pPr>
+        <w:spacing w:before="0" w:after="120" w:line="300" w:lineRule="auto"/>
+      </w:pPr>
+    </w:p>
+    <w:tbl>
+      <w:tblPr>
+        <w:tblW w:type="auto" w:w="0"/>
+        <w:jc w:val="center"/>
+        <w:tblBorders>
+          <w:top w:val="single" w:sz="8" w:space="0" w:color="6B3FA0"/>
+          <w:left w:val="single" w:sz="8" w:space="0" w:color="6B3FA0"/>
+          <w:bottom w:val="single" w:sz="8" w:space="0" w:color="6B3FA0"/>
+          <w:right w:val="single" w:sz="8" w:space="0" w:color="6B3FA0"/>
+          <w:insideH w:val="single" w:sz="8" w:space="0" w:color="6B3FA0"/>
+          <w:insideV w:val="single" w:sz="8" w:space="0" w:color="6B3FA0"/>
+        </w:tblBorders>
+        <w:tblLook w:firstColumn="1" w:firstRow="1" w:lastColumn="0" w:lastRow="0" w:noHBand="0" w:noVBand="1" w:val="04A0"/>
+      </w:tblPr>
+      <w:tblGrid>
+        <w:gridCol w:w="9298"/>
+      </w:tblGrid>
+      <w:tr>
+        <w:tc>
+          <w:tcPr>
+            <w:tcW w:type="dxa" w:w="9298"/>
+            <w:shd w:val="clear" w:color="auto" w:fill="F0EAF8"/>
+          </w:tcPr>
+          <w:p>
+            <w:pPr>
+              <w:spacing w:after="80"/>
+            </w:pPr>
+            <w:r>
+              <w:rPr>
+                <w:b/>
+                <w:color w:val="6B3FA0"/>
+                <w:sz w:val="22"/>
+              </w:rPr>
+              <w:t>Twee uitgangspunten bij het stappenplan</w:t>
+            </w:r>
+          </w:p>
+          <w:p>
+            <w:pPr>
+              <w:spacing w:after="40" w:line="288" w:lineRule="auto"/>
+            </w:pPr>
+            <w:r>
+              <w:rPr>
+                <w:color w:val="1B2430"/>
+                <w:sz w:val="20"/>
+              </w:rPr>
+              <w:t>Fysiek gaat voor personeel: eerst wat en waar, daarna volgt de personele inzet daaruit.</w:t>
+            </w:r>
+          </w:p>
+          <w:p>
+            <w:pPr>
+              <w:spacing w:after="40" w:line="288" w:lineRule="auto"/>
+            </w:pPr>
+            <w:r>
+              <w:rPr>
+                <w:color w:val="1B2430"/>
+                <w:sz w:val="20"/>
+              </w:rPr>
+              <w:t>Scheiden in perioden: nu en heel 2026, oudbouw 2027, de verhuisperiode, en de nieuwbouw vanaf juni 2027.</w:t>
+            </w:r>
+          </w:p>
+        </w:tc>
+      </w:tr>
+    </w:tbl>
+    <w:p>
+      <w:pPr>
+        <w:spacing w:after="80"/>
+      </w:pPr>
+    </w:p>
+    <w:p>
+      <w:r>
+        <w:br w:type="page"/>
+      </w:r>
+    </w:p>
+    <w:p>
+      <w:pPr>
+        <w:pStyle w:val="Heading1"/>
+        <w:pBdr>
+          <w:bottom w:val="single" w:sz="6" w:space="4" w:color="D2691E"/>
+        </w:pBdr>
+        <w:spacing w:before="360" w:after="120"/>
+      </w:pPr>
+      <w:r>
+        <w:rPr>
+          <w:rFonts w:ascii="Calibri" w:hAnsi="Calibri"/>
+          <w:color w:val="D2691E"/>
+          <w:sz w:val="34"/>
+        </w:rPr>
+        <w:t>5. Openstaande vragen</w:t>
+      </w:r>
+    </w:p>
+    <w:p>
+      <w:pPr>
+        <w:spacing w:before="0" w:after="160"/>
+      </w:pPr>
+      <w:r>
+        <w:rPr>
+          <w:i/>
+          <w:color w:val="5A6472"/>
+          <w:sz w:val="18"/>
+        </w:rPr>
+        <w:t>Foto 11 - linkerdeel van het bord, onderste helft</w:t>
+      </w:r>
+    </w:p>
+    <w:p>
+      <w:pPr>
+        <w:spacing w:before="0" w:after="120" w:line="300" w:lineRule="auto"/>
+      </w:pPr>
+      <w:r>
+        <w:rPr>
+          <w:b w:val="0"/>
+          <w:i w:val="0"/>
+          <w:color w:val="1B2430"/>
+          <w:sz w:val="21"/>
+        </w:rPr>
+        <w:t>De openstaande vragen op het bord vallen uiteen in twee sporen: vragen over de fysieke planning en vragen over de personele inzet.</w:t>
+      </w:r>
+    </w:p>
+    <w:p>
+      <w:pPr>
+        <w:spacing w:before="120" w:after="40"/>
+        <w:jc w:val="center"/>
+      </w:pPr>
+      <w:r>
+        <w:drawing>
+          <wp:inline xmlns:a="http://schemas.openxmlformats.org/drawingml/2006/main" xmlns:pic="http://schemas.openxmlformats.org/drawingml/2006/picture">
+            <wp:extent cx="5903999" cy="3795428"/>
+            <wp:docPr id="5" name="Picture 5"/>
+            <wp:cNvGraphicFramePr>
+              <a:graphicFrameLocks noChangeAspect="1"/>
+            </wp:cNvGraphicFramePr>
+            <a:graphic>
+              <a:graphicData uri="http://schemas.openxmlformats.org/drawingml/2006/picture">
+                <pic:pic>
+                  <pic:nvPicPr>
+                    <pic:cNvPr id="0" name="fig09_vragen.png"/>
+                    <pic:cNvPicPr/>
+                  </pic:nvPicPr>
+                  <pic:blipFill>
+                    <a:blip r:embed="rId14"/>
+                    <a:stretch>
+                      <a:fillRect/>
+                    </a:stretch>
+                  </pic:blipFill>
+                  <pic:spPr>
+                    <a:xfrm>
+                      <a:off x="0" y="0"/>
+                      <a:ext cx="5903999" cy="3795428"/>
+                    </a:xfrm>
+                    <a:prstGeom prst="rect"/>
+                  </pic:spPr>
+                </pic:pic>
+              </a:graphicData>
+            </a:graphic>
+          </wp:inline>
+        </w:drawing>
+      </w:r>
+    </w:p>
+    <w:p>
+      <w:pPr>
+        <w:spacing w:after="240"/>
+        <w:jc w:val="center"/>
+      </w:pPr>
+      <w:r>
+        <w:rPr>
+          <w:i/>
+          <w:color w:val="5A6472"/>
+          <w:sz w:val="18"/>
+        </w:rPr>
+        <w:t>Figuur 5 - Openstaande vragen langs twee sporen</w:t>
+      </w:r>
+    </w:p>
+    <w:p>
+      <w:pPr>
+        <w:pStyle w:val="Heading2"/>
+        <w:spacing w:before="240" w:after="120"/>
+      </w:pPr>
+      <w:r>
+        <w:rPr>
+          <w:rFonts w:ascii="Calibri" w:hAnsi="Calibri"/>
+          <w:color w:val="1F5FA8"/>
+          <w:sz w:val="26"/>
+        </w:rPr>
+        <w:t>Fysieke planning</w:t>
+      </w:r>
+    </w:p>
+    <w:p>
+      <w:pPr>
+        <w:pStyle w:val="ListNumber"/>
+        <w:spacing w:after="60" w:line="288" w:lineRule="auto"/>
+      </w:pPr>
+      <w:r>
+        <w:rPr>
+          <w:color w:val="1B2430"/>
+          <w:sz w:val="21"/>
+        </w:rPr>
+        <w:t>Waar komt de recoverypatiënt in avond, nacht en weekend?</w:t>
+      </w:r>
+    </w:p>
+    <w:p>
+      <w:pPr>
+        <w:pStyle w:val="ListNumber"/>
+        <w:spacing w:after="60" w:line="288" w:lineRule="auto"/>
+      </w:pPr>
+      <w:r>
+        <w:rPr>
+          <w:color w:val="1B2430"/>
+          <w:sz w:val="21"/>
+        </w:rPr>
+        <w:t>Waar komt de cardioversie?</w:t>
+      </w:r>
+    </w:p>
+    <w:p>
+      <w:pPr>
+        <w:pStyle w:val="ListNumber"/>
+        <w:spacing w:after="60" w:line="288" w:lineRule="auto"/>
+      </w:pPr>
+      <w:r>
+        <w:rPr>
+          <w:color w:val="1B2430"/>
+          <w:sz w:val="21"/>
+        </w:rPr>
+        <w:t>Hoort de EHH bij de SEH of bij de Hotfloor?</w:t>
+      </w:r>
+    </w:p>
+    <w:p>
+      <w:pPr>
+        <w:pStyle w:val="ListNumber"/>
+        <w:spacing w:after="60" w:line="288" w:lineRule="auto"/>
+      </w:pPr>
+      <w:r>
+        <w:rPr>
+          <w:color w:val="1B2430"/>
+          <w:sz w:val="21"/>
+        </w:rPr>
+        <w:t>Komt de OSAS post-OK patiënt nog op de ICU?</w:t>
+      </w:r>
+    </w:p>
+    <w:p>
+      <w:pPr>
+        <w:pStyle w:val="Heading2"/>
+        <w:spacing w:before="240" w:after="120"/>
+      </w:pPr>
+      <w:r>
+        <w:rPr>
+          <w:rFonts w:ascii="Calibri" w:hAnsi="Calibri"/>
+          <w:color w:val="6B3FA0"/>
+          <w:sz w:val="26"/>
+        </w:rPr>
+        <w:t>Personele inzet en opleiden</w:t>
+      </w:r>
+    </w:p>
+    <w:p>
+      <w:pPr>
+        <w:pStyle w:val="ListNumber"/>
+        <w:spacing w:after="60" w:line="288" w:lineRule="auto"/>
+      </w:pPr>
+      <w:r>
+        <w:rPr>
+          <w:color w:val="1B2430"/>
+          <w:sz w:val="21"/>
+        </w:rPr>
+        <w:t>Wat gebeurt er met de scopedienst van de CCU?</w:t>
+      </w:r>
+    </w:p>
+    <w:p>
+      <w:pPr>
+        <w:pStyle w:val="ListNumber"/>
+        <w:spacing w:after="60" w:line="288" w:lineRule="auto"/>
+      </w:pPr>
+      <w:r>
+        <w:rPr>
+          <w:color w:val="1B2430"/>
+          <w:sz w:val="21"/>
+        </w:rPr>
+        <w:t>Welke norm geldt er voor de Hotfloor?</w:t>
+      </w:r>
+    </w:p>
+    <w:p>
+      <w:pPr>
+        <w:pStyle w:val="ListNumber"/>
+        <w:spacing w:after="60" w:line="288" w:lineRule="auto"/>
+      </w:pPr>
+      <w:r>
+        <w:rPr>
+          <w:color w:val="1B2430"/>
+          <w:sz w:val="21"/>
+        </w:rPr>
+        <w:t>Inzet van de kinderverpleegkundige op de SEH?</w:t>
+      </w:r>
+    </w:p>
+    <w:p>
+      <w:pPr>
+        <w:spacing w:before="0" w:after="120" w:line="300" w:lineRule="auto"/>
+      </w:pPr>
+    </w:p>
+    <w:tbl>
+      <w:tblPr>
+        <w:tblW w:type="auto" w:w="0"/>
+        <w:jc w:val="center"/>
+        <w:tblBorders>
+          <w:top w:val="single" w:sz="8" w:space="0" w:color="D2691E"/>
+          <w:left w:val="single" w:sz="8" w:space="0" w:color="D2691E"/>
+          <w:bottom w:val="single" w:sz="8" w:space="0" w:color="D2691E"/>
+          <w:right w:val="single" w:sz="8" w:space="0" w:color="D2691E"/>
+          <w:insideH w:val="single" w:sz="8" w:space="0" w:color="D2691E"/>
+          <w:insideV w:val="single" w:sz="8" w:space="0" w:color="D2691E"/>
+        </w:tblBorders>
+        <w:tblLook w:firstColumn="1" w:firstRow="1" w:lastColumn="0" w:lastRow="0" w:noHBand="0" w:noVBand="1" w:val="04A0"/>
+      </w:tblPr>
+      <w:tblGrid>
+        <w:gridCol w:w="9298"/>
+      </w:tblGrid>
+      <w:tr>
+        <w:tc>
+          <w:tcPr>
+            <w:tcW w:type="dxa" w:w="9298"/>
+            <w:shd w:val="clear" w:color="auto" w:fill="FBEEE3"/>
+          </w:tcPr>
+          <w:p>
+            <w:pPr>
+              <w:spacing w:after="80"/>
+            </w:pPr>
+            <w:r>
+              <w:rPr>
+                <w:b/>
+                <w:color w:val="D2691E"/>
+                <w:sz w:val="22"/>
+              </w:rPr>
+              <w:t>Actie</w:t>
+            </w:r>
+          </w:p>
+          <w:p>
+            <w:pPr>
+              <w:spacing w:after="40" w:line="288" w:lineRule="auto"/>
+            </w:pPr>
+            <w:r>
+              <w:rPr>
+                <w:color w:val="1B2430"/>
+                <w:sz w:val="20"/>
+              </w:rPr>
+              <w:t>Deze lijst aanvullen met de vragen van Lonneke en Maxim.</w:t>
+            </w:r>
+          </w:p>
+        </w:tc>
+      </w:tr>
+    </w:tbl>
+    <w:p>
+      <w:pPr>
+        <w:spacing w:after="80"/>
+      </w:pPr>
+    </w:p>
+    <w:p>
+      <w:r>
+        <w:br w:type="page"/>
+      </w:r>
+    </w:p>
+    <w:p>
+      <w:pPr>
+        <w:pStyle w:val="Heading1"/>
+        <w:pBdr>
+          <w:bottom w:val="single" w:sz="6" w:space="4" w:color="1F5FA8"/>
+        </w:pBdr>
+        <w:spacing w:before="360" w:after="120"/>
+      </w:pPr>
+      <w:r>
+        <w:rPr>
+          <w:rFonts w:ascii="Calibri" w:hAnsi="Calibri"/>
+          <w:color w:val="1F5FA8"/>
+          <w:sz w:val="34"/>
+        </w:rPr>
+        <w:t>6. Vertrekpunt, planning en scenario's</w:t>
+      </w:r>
+    </w:p>
+    <w:p>
+      <w:pPr>
+        <w:spacing w:before="0" w:after="160"/>
+      </w:pPr>
+      <w:r>
+        <w:rPr>
+          <w:i/>
+          <w:color w:val="5A6472"/>
+          <w:sz w:val="18"/>
+        </w:rPr>
+        <w:t>Foto 13 - linkerdeel van het bord, bovenste helft</w:t>
+      </w:r>
+    </w:p>
+    <w:p>
+      <w:pPr>
+        <w:spacing w:before="0" w:after="120" w:line="300" w:lineRule="auto"/>
+      </w:pPr>
+      <w:r>
+        <w:rPr>
+          <w:b w:val="0"/>
+          <w:i w:val="0"/>
+          <w:color w:val="1B2430"/>
+          <w:sz w:val="21"/>
+        </w:rPr>
+        <w:t>Linksboven op het bord staat de planning: vier perioden, met per periode een andere vraag. Daaronder staan de vijf scenario's die uitgewerkt moeten worden.</w:t>
       </w:r>
     </w:p>
     <w:p>
@@ -548,7 +1781,7 @@
         <w:drawing>
           <wp:inline xmlns:a="http://schemas.openxmlformats.org/drawingml/2006/main" xmlns:pic="http://schemas.openxmlformats.org/drawingml/2006/picture">
             <wp:extent cx="5903999" cy="4174971"/>
-            <wp:docPr id="2" name="Picture 2"/>
+            <wp:docPr id="6" name="Picture 6"/>
             <wp:cNvGraphicFramePr>
               <a:graphicFrameLocks noChangeAspect="1"/>
             </wp:cNvGraphicFramePr>
@@ -560,7 +1793,7 @@
                     <pic:cNvPicPr/>
                   </pic:nvPicPr>
                   <pic:blipFill>
-                    <a:blip r:embed="rId11"/>
+                    <a:blip r:embed="rId15"/>
                     <a:stretch>
                       <a:fillRect/>
                     </a:stretch>
@@ -590,7 +1823,7 @@
           <w:color w:val="5A6472"/>
           <w:sz w:val="18"/>
         </w:rPr>
-        <w:t>Figuur 2 - Vier perioden, de ontbrekende randvoorwaarde en de kernvraag</w:t>
+        <w:t>Figuur 6 - Vier perioden, de ontbrekende randvoorwaarde en de kernvraag</w:t>
       </w:r>
     </w:p>
     <w:p>
@@ -604,7 +1837,7 @@
           <w:color w:val="1F5FA8"/>
           <w:sz w:val="26"/>
         </w:rPr>
-        <w:t>Wat staat er op het bord</w:t>
+        <w:t>Wat staat er op het bord: plan</w:t>
       </w:r>
     </w:p>
     <w:p>
@@ -660,549 +1893,6 @@
       </w:r>
     </w:p>
     <w:p>
-      <w:r>
-        <w:br w:type="page"/>
-      </w:r>
-    </w:p>
-    <w:p>
-      <w:pPr>
-        <w:pStyle w:val="Heading1"/>
-        <w:pBdr>
-          <w:bottom w:val="single" w:sz="6" w:space="4" w:color="6B3FA0"/>
-        </w:pBdr>
-        <w:spacing w:before="360" w:after="120"/>
-      </w:pPr>
-      <w:r>
-        <w:rPr>
-          <w:rFonts w:ascii="Calibri" w:hAnsi="Calibri"/>
-          <w:color w:val="6B3FA0"/>
-          <w:sz w:val="34"/>
-        </w:rPr>
-        <w:t>2. Tijdlijn en berekeningen</w:t>
-      </w:r>
-    </w:p>
-    <w:p>
-      <w:pPr>
-        <w:spacing w:before="0" w:after="120" w:line="300" w:lineRule="auto"/>
-      </w:pPr>
-      <w:r>
-        <w:rPr>
-          <w:b w:val="0"/>
-          <w:i w:val="0"/>
-          <w:color w:val="1B2430"/>
-          <w:sz w:val="21"/>
-        </w:rPr>
-        <w:t>Op de tijdlijn staat wat er tussen september 2026 en de verhuizing gereed moet zijn. De maanden oktober tot en met mei zijn op het bord omkaderd: dat is de periode waarin de voorbereiding en het werken in de oudbouw plaatsvinden.</w:t>
-      </w:r>
-    </w:p>
-    <w:p>
-      <w:pPr>
-        <w:spacing w:before="120" w:after="40"/>
-        <w:jc w:val="center"/>
-      </w:pPr>
-      <w:r>
-        <w:drawing>
-          <wp:inline xmlns:a="http://schemas.openxmlformats.org/drawingml/2006/main" xmlns:pic="http://schemas.openxmlformats.org/drawingml/2006/picture">
-            <wp:extent cx="5903999" cy="3795428"/>
-            <wp:docPr id="3" name="Picture 3"/>
-            <wp:cNvGraphicFramePr>
-              <a:graphicFrameLocks noChangeAspect="1"/>
-            </wp:cNvGraphicFramePr>
-            <a:graphic>
-              <a:graphicData uri="http://schemas.openxmlformats.org/drawingml/2006/picture">
-                <pic:pic>
-                  <pic:nvPicPr>
-                    <pic:cNvPr id="0" name="fig03_tijdlijn.png"/>
-                    <pic:cNvPicPr/>
-                  </pic:nvPicPr>
-                  <pic:blipFill>
-                    <a:blip r:embed="rId12"/>
-                    <a:stretch>
-                      <a:fillRect/>
-                    </a:stretch>
-                  </pic:blipFill>
-                  <pic:spPr>
-                    <a:xfrm>
-                      <a:off x="0" y="0"/>
-                      <a:ext cx="5903999" cy="3795428"/>
-                    </a:xfrm>
-                    <a:prstGeom prst="rect"/>
-                  </pic:spPr>
-                </pic:pic>
-              </a:graphicData>
-            </a:graphic>
-          </wp:inline>
-        </w:drawing>
-      </w:r>
-    </w:p>
-    <w:p>
-      <w:pPr>
-        <w:spacing w:after="240"/>
-        <w:jc w:val="center"/>
-      </w:pPr>
-      <w:r>
-        <w:rPr>
-          <w:i/>
-          <w:color w:val="5A6472"/>
-          <w:sz w:val="18"/>
-        </w:rPr>
-        <w:t>Figuur 3 - Tijdlijn van september tot de verhuizing en de drie berekeningen</w:t>
-      </w:r>
-    </w:p>
-    <w:p>
-      <w:pPr>
-        <w:pStyle w:val="Heading2"/>
-        <w:spacing w:before="240" w:after="120"/>
-      </w:pPr>
-      <w:r>
-        <w:rPr>
-          <w:rFonts w:ascii="Calibri" w:hAnsi="Calibri"/>
-          <w:color w:val="6B3FA0"/>
-          <w:sz w:val="26"/>
-        </w:rPr>
-        <w:t>Wat staat er op het bord</w:t>
-      </w:r>
-    </w:p>
-    <w:p>
-      <w:pPr>
-        <w:pStyle w:val="ListBullet"/>
-        <w:spacing w:after="60" w:line="288" w:lineRule="auto"/>
-      </w:pPr>
-      <w:r>
-        <w:rPr>
-          <w:color w:val="1B2430"/>
-          <w:sz w:val="21"/>
-        </w:rPr>
-        <w:t>September 2026: start van de berekeningen.</w:t>
-      </w:r>
-    </w:p>
-    <w:p>
-      <w:pPr>
-        <w:pStyle w:val="ListBullet"/>
-        <w:spacing w:after="60" w:line="288" w:lineRule="auto"/>
-      </w:pPr>
-      <w:r>
-        <w:rPr>
-          <w:color w:val="1B2430"/>
-          <w:sz w:val="21"/>
-        </w:rPr>
-        <w:t>Aantal bedden op basis van patiëntaanwezigheid gereed.</w:t>
-      </w:r>
-    </w:p>
-    <w:p>
-      <w:pPr>
-        <w:pStyle w:val="ListBullet"/>
-        <w:spacing w:after="60" w:line="288" w:lineRule="auto"/>
-      </w:pPr>
-      <w:r>
-        <w:rPr>
-          <w:color w:val="1B2430"/>
-          <w:sz w:val="21"/>
-        </w:rPr>
-        <w:t>Norm verpleegkundigen patiëntenzorg gereed, uitgesplitst naar D, L en N.</w:t>
-      </w:r>
-    </w:p>
-    <w:p>
-      <w:pPr>
-        <w:pStyle w:val="ListBullet"/>
-        <w:spacing w:after="60" w:line="288" w:lineRule="auto"/>
-      </w:pPr>
-      <w:r>
-        <w:rPr>
-          <w:color w:val="1B2430"/>
-          <w:sz w:val="21"/>
-        </w:rPr>
-        <w:t>Indirecte uren per afdeling gereed.</w:t>
-      </w:r>
-    </w:p>
-    <w:p>
-      <w:pPr>
-        <w:pStyle w:val="ListBullet"/>
-        <w:spacing w:after="60" w:line="288" w:lineRule="auto"/>
-      </w:pPr>
-      <w:r>
-        <w:rPr>
-          <w:color w:val="1B2430"/>
-          <w:sz w:val="21"/>
-        </w:rPr>
-        <w:t>Juni: verhuizing.</w:t>
-      </w:r>
-    </w:p>
-    <w:p>
-      <w:r>
-        <w:br w:type="page"/>
-      </w:r>
-    </w:p>
-    <w:p>
-      <w:pPr>
-        <w:pStyle w:val="Heading1"/>
-        <w:pBdr>
-          <w:bottom w:val="single" w:sz="6" w:space="4" w:color="1F5FA8"/>
-        </w:pBdr>
-        <w:spacing w:before="360" w:after="120"/>
-      </w:pPr>
-      <w:r>
-        <w:rPr>
-          <w:rFonts w:ascii="Calibri" w:hAnsi="Calibri"/>
-          <w:color w:val="1F5FA8"/>
-          <w:sz w:val="34"/>
-        </w:rPr>
-        <w:t>3. Oud versus nieuw</w:t>
-      </w:r>
-    </w:p>
-    <w:p>
-      <w:pPr>
-        <w:spacing w:before="0" w:after="120" w:line="300" w:lineRule="auto"/>
-      </w:pPr>
-      <w:r>
-        <w:rPr>
-          <w:b w:val="0"/>
-          <w:i w:val="0"/>
-          <w:color w:val="1B2430"/>
-          <w:sz w:val="21"/>
-        </w:rPr>
-        <w:t>De kern van de verandering: waar de acute en intensieve zorg nu over vier plaatsen in het gebouw verdeeld is, komt die straks in twee clusters te liggen.</w:t>
-      </w:r>
-    </w:p>
-    <w:p>
-      <w:pPr>
-        <w:spacing w:before="120" w:after="40"/>
-        <w:jc w:val="center"/>
-      </w:pPr>
-      <w:r>
-        <w:drawing>
-          <wp:inline xmlns:a="http://schemas.openxmlformats.org/drawingml/2006/main" xmlns:pic="http://schemas.openxmlformats.org/drawingml/2006/picture">
-            <wp:extent cx="5903999" cy="4006285"/>
-            <wp:docPr id="4" name="Picture 4"/>
-            <wp:cNvGraphicFramePr>
-              <a:graphicFrameLocks noChangeAspect="1"/>
-            </wp:cNvGraphicFramePr>
-            <a:graphic>
-              <a:graphicData uri="http://schemas.openxmlformats.org/drawingml/2006/picture">
-                <pic:pic>
-                  <pic:nvPicPr>
-                    <pic:cNvPr id="0" name="fig04_oud_nieuw.png"/>
-                    <pic:cNvPicPr/>
-                  </pic:nvPicPr>
-                  <pic:blipFill>
-                    <a:blip r:embed="rId13"/>
-                    <a:stretch>
-                      <a:fillRect/>
-                    </a:stretch>
-                  </pic:blipFill>
-                  <pic:spPr>
-                    <a:xfrm>
-                      <a:off x="0" y="0"/>
-                      <a:ext cx="5903999" cy="4006285"/>
-                    </a:xfrm>
-                    <a:prstGeom prst="rect"/>
-                  </pic:spPr>
-                </pic:pic>
-              </a:graphicData>
-            </a:graphic>
-          </wp:inline>
-        </w:drawing>
-      </w:r>
-    </w:p>
-    <w:p>
-      <w:pPr>
-        <w:spacing w:after="240"/>
-        <w:jc w:val="center"/>
-      </w:pPr>
-      <w:r>
-        <w:rPr>
-          <w:i/>
-          <w:color w:val="5A6472"/>
-          <w:sz w:val="18"/>
-        </w:rPr>
-        <w:t>Figuur 4 - Van vier verspreide afdelingen naar acute poort en Hotfloor</w:t>
-      </w:r>
-    </w:p>
-    <w:p>
-      <w:pPr>
-        <w:pStyle w:val="Heading2"/>
-        <w:spacing w:before="240" w:after="120"/>
-      </w:pPr>
-      <w:r>
-        <w:rPr>
-          <w:rFonts w:ascii="Calibri" w:hAnsi="Calibri"/>
-          <w:color w:val="1F5FA8"/>
-          <w:sz w:val="26"/>
-        </w:rPr>
-        <w:t>Wat staat er op het bord</w:t>
-      </w:r>
-    </w:p>
-    <w:p>
-      <w:pPr>
-        <w:pStyle w:val="ListBullet"/>
-        <w:spacing w:after="60" w:line="288" w:lineRule="auto"/>
-      </w:pPr>
-      <w:r>
-        <w:rPr>
-          <w:color w:val="1B2430"/>
-          <w:sz w:val="21"/>
-        </w:rPr>
-        <w:t>Oud: kind spoed bij de kinderafdeling/poli, SEH op de begane grond, ICU op de 2e verdieping, CCU/SCU/EHH op de 1e verdieping.</w:t>
-      </w:r>
-    </w:p>
-    <w:p>
-      <w:pPr>
-        <w:pStyle w:val="ListBullet"/>
-        <w:spacing w:after="60" w:line="288" w:lineRule="auto"/>
-      </w:pPr>
-      <w:r>
-        <w:rPr>
-          <w:color w:val="1B2430"/>
-          <w:sz w:val="21"/>
-        </w:rPr>
-        <w:t>Nieuw 1: SEH met acute poort, met daarin kind, EHH en SEH.</w:t>
-      </w:r>
-    </w:p>
-    <w:p>
-      <w:pPr>
-        <w:pStyle w:val="ListBullet"/>
-        <w:spacing w:after="60" w:line="288" w:lineRule="auto"/>
-      </w:pPr>
-      <w:r>
-        <w:rPr>
-          <w:color w:val="1B2430"/>
-          <w:sz w:val="21"/>
-        </w:rPr>
-        <w:t>Nieuw 2: Hotfloor, met daarin ICU en CCU/SCU.</w:t>
-      </w:r>
-    </w:p>
-    <w:p>
-      <w:pPr>
-        <w:pStyle w:val="ListBullet"/>
-        <w:spacing w:after="60" w:line="288" w:lineRule="auto"/>
-      </w:pPr>
-      <w:r>
-        <w:rPr>
-          <w:color w:val="1B2430"/>
-          <w:sz w:val="21"/>
-        </w:rPr>
-        <w:t>Fysieke plekken: hoeveel plekken zijn er nodig? En zijn dit er 16?</w:t>
-      </w:r>
-    </w:p>
-    <w:p>
-      <w:r>
-        <w:br w:type="page"/>
-      </w:r>
-    </w:p>
-    <w:p>
-      <w:pPr>
-        <w:pStyle w:val="Heading1"/>
-        <w:pBdr>
-          <w:bottom w:val="single" w:sz="6" w:space="4" w:color="0E9A87"/>
-        </w:pBdr>
-        <w:spacing w:before="360" w:after="120"/>
-      </w:pPr>
-      <w:r>
-        <w:rPr>
-          <w:rFonts w:ascii="Calibri" w:hAnsi="Calibri"/>
-          <w:color w:val="0E9A87"/>
-          <w:sz w:val="34"/>
-        </w:rPr>
-        <w:t>4. Plattegrond nieuwbouw en fysieke plekken</w:t>
-      </w:r>
-    </w:p>
-    <w:p>
-      <w:pPr>
-        <w:spacing w:before="0" w:after="120" w:line="300" w:lineRule="auto"/>
-      </w:pPr>
-      <w:r>
-        <w:rPr>
-          <w:b w:val="0"/>
-          <w:i w:val="0"/>
-          <w:color w:val="1B2430"/>
-          <w:sz w:val="21"/>
-        </w:rPr>
-        <w:t>De plattegrond van de nieuwbouw kent drie ruimtes. Alleen voor de Hotfloor staat het aantal plekken vast; voor de SEH en de EHH staat er nog een vraagteken.</w:t>
-      </w:r>
-    </w:p>
-    <w:p>
-      <w:pPr>
-        <w:spacing w:before="120" w:after="40"/>
-        <w:jc w:val="center"/>
-      </w:pPr>
-      <w:r>
-        <w:drawing>
-          <wp:inline xmlns:a="http://schemas.openxmlformats.org/drawingml/2006/main" xmlns:pic="http://schemas.openxmlformats.org/drawingml/2006/picture">
-            <wp:extent cx="5903999" cy="3626742"/>
-            <wp:docPr id="5" name="Picture 5"/>
-            <wp:cNvGraphicFramePr>
-              <a:graphicFrameLocks noChangeAspect="1"/>
-            </wp:cNvGraphicFramePr>
-            <a:graphic>
-              <a:graphicData uri="http://schemas.openxmlformats.org/drawingml/2006/picture">
-                <pic:pic>
-                  <pic:nvPicPr>
-                    <pic:cNvPr id="0" name="fig05_plattegrond.png"/>
-                    <pic:cNvPicPr/>
-                  </pic:nvPicPr>
-                  <pic:blipFill>
-                    <a:blip r:embed="rId14"/>
-                    <a:stretch>
-                      <a:fillRect/>
-                    </a:stretch>
-                  </pic:blipFill>
-                  <pic:spPr>
-                    <a:xfrm>
-                      <a:off x="0" y="0"/>
-                      <a:ext cx="5903999" cy="3626742"/>
-                    </a:xfrm>
-                    <a:prstGeom prst="rect"/>
-                  </pic:spPr>
-                </pic:pic>
-              </a:graphicData>
-            </a:graphic>
-          </wp:inline>
-        </w:drawing>
-      </w:r>
-    </w:p>
-    <w:p>
-      <w:pPr>
-        <w:spacing w:after="240"/>
-        <w:jc w:val="center"/>
-      </w:pPr>
-      <w:r>
-        <w:rPr>
-          <w:i/>
-          <w:color w:val="5A6472"/>
-          <w:sz w:val="18"/>
-        </w:rPr>
-        <w:t>Figuur 5 - Plattegrond, aantallen en wat er per plek uitgeschreven moet worden</w:t>
-      </w:r>
-    </w:p>
-    <w:p>
-      <w:pPr>
-        <w:pStyle w:val="Heading2"/>
-        <w:spacing w:before="240" w:after="120"/>
-      </w:pPr>
-      <w:r>
-        <w:rPr>
-          <w:rFonts w:ascii="Calibri" w:hAnsi="Calibri"/>
-          <w:color w:val="0E9A87"/>
-          <w:sz w:val="26"/>
-        </w:rPr>
-        <w:t>Wat staat er op het bord</w:t>
-      </w:r>
-    </w:p>
-    <w:p>
-      <w:pPr>
-        <w:pStyle w:val="ListBullet"/>
-        <w:spacing w:after="60" w:line="288" w:lineRule="auto"/>
-      </w:pPr>
-      <w:r>
-        <w:rPr>
-          <w:color w:val="1B2430"/>
-          <w:sz w:val="21"/>
-        </w:rPr>
-        <w:t>Scenario nieuwbouw fysiek: Hotfloor = 16 bedden, SEH = ? plekken, EHH = ? plekken.</w:t>
-      </w:r>
-    </w:p>
-    <w:p>
-      <w:pPr>
-        <w:pStyle w:val="ListBullet"/>
-        <w:spacing w:after="60" w:line="288" w:lineRule="auto"/>
-      </w:pPr>
-      <w:r>
-        <w:rPr>
-          <w:color w:val="1B2430"/>
-          <w:sz w:val="21"/>
-        </w:rPr>
-        <w:t>Fysieke plekken uitschrijven aan de hand van kamernummer en type, eventueel met middelen en materialen.</w:t>
-      </w:r>
-    </w:p>
-    <w:p>
-      <w:pPr>
-        <w:pStyle w:val="ListBullet"/>
-        <w:spacing w:after="60" w:line="288" w:lineRule="auto"/>
-      </w:pPr>
-      <w:r>
-        <w:rPr>
-          <w:color w:val="1B2430"/>
-          <w:sz w:val="21"/>
-        </w:rPr>
-        <w:t>Onderscheid tussen fysieke plekken, specifieke plekken en middelen/materialen/apparatuur.</w:t>
-      </w:r>
-    </w:p>
-    <w:p>
-      <w:pPr>
-        <w:pStyle w:val="ListBullet"/>
-        <w:spacing w:after="60" w:line="288" w:lineRule="auto"/>
-      </w:pPr>
-      <w:r>
-        <w:rPr>
-          <w:color w:val="1B2430"/>
-          <w:sz w:val="21"/>
-        </w:rPr>
-        <w:t>Bijvoorbeeld: kan er overal beademd worden?</w:t>
-      </w:r>
-    </w:p>
-    <w:p>
-      <w:pPr>
-        <w:pStyle w:val="ListBullet"/>
-        <w:spacing w:after="60" w:line="288" w:lineRule="auto"/>
-      </w:pPr>
-      <w:r>
-        <w:rPr>
-          <w:color w:val="1B2430"/>
-          <w:sz w:val="21"/>
-        </w:rPr>
-        <w:t>Kan elke zorgvraag in elke kamer?</w:t>
-      </w:r>
-    </w:p>
-    <w:p>
-      <w:pPr>
-        <w:pStyle w:val="ListBullet"/>
-        <w:spacing w:after="60" w:line="288" w:lineRule="auto"/>
-      </w:pPr>
-      <w:r>
-        <w:rPr>
-          <w:color w:val="1B2430"/>
-          <w:sz w:val="21"/>
-        </w:rPr>
-        <w:t>Is er een basisverdeling fysiek voor ICU, CCU en SCU?</w:t>
-      </w:r>
-    </w:p>
-    <w:p>
-      <w:r>
-        <w:br w:type="page"/>
-      </w:r>
-    </w:p>
-    <w:p>
-      <w:pPr>
-        <w:pStyle w:val="Heading1"/>
-        <w:pBdr>
-          <w:bottom w:val="single" w:sz="6" w:space="4" w:color="1F5FA8"/>
-        </w:pBdr>
-        <w:spacing w:before="360" w:after="120"/>
-      </w:pPr>
-      <w:r>
-        <w:rPr>
-          <w:rFonts w:ascii="Calibri" w:hAnsi="Calibri"/>
-          <w:color w:val="1F5FA8"/>
-          <w:sz w:val="34"/>
-        </w:rPr>
-        <w:t>5. Scenario's</w:t>
-      </w:r>
-    </w:p>
-    <w:p>
-      <w:pPr>
-        <w:spacing w:before="0" w:after="120" w:line="300" w:lineRule="auto"/>
-      </w:pPr>
-      <w:r>
-        <w:rPr>
-          <w:b w:val="0"/>
-          <w:i w:val="0"/>
-          <w:color w:val="1B2430"/>
-          <w:sz w:val="21"/>
-        </w:rPr>
-        <w:t>Op het bord staan vijf mogelijke scenario's. Ze zijn niet gelijkwaardig: scenario 5 is het handhaven van de huidige situatie en dient als referentie voor de andere vier.</w:t>
-      </w:r>
-    </w:p>
-    <w:p>
       <w:pPr>
         <w:spacing w:before="120" w:after="40"/>
         <w:jc w:val="center"/>
@@ -1211,7 +1901,7 @@
         <w:drawing>
           <wp:inline xmlns:a="http://schemas.openxmlformats.org/drawingml/2006/main" xmlns:pic="http://schemas.openxmlformats.org/drawingml/2006/picture">
             <wp:extent cx="5903999" cy="3711085"/>
-            <wp:docPr id="6" name="Picture 6"/>
+            <wp:docPr id="7" name="Picture 7"/>
             <wp:cNvGraphicFramePr>
               <a:graphicFrameLocks noChangeAspect="1"/>
             </wp:cNvGraphicFramePr>
@@ -1223,7 +1913,7 @@
                     <pic:cNvPicPr/>
                   </pic:nvPicPr>
                   <pic:blipFill>
-                    <a:blip r:embed="rId15"/>
+                    <a:blip r:embed="rId16"/>
                     <a:stretch>
                       <a:fillRect/>
                     </a:stretch>
@@ -1253,7 +1943,7 @@
           <w:color w:val="5A6472"/>
           <w:sz w:val="18"/>
         </w:rPr>
-        <w:t>Figuur 6 - De vijf scenario's en het effect dat elk scenario heeft</w:t>
+        <w:t>Figuur 7 - De vijf scenario's en het effect dat elk scenario heeft</w:t>
       </w:r>
     </w:p>
     <w:p>
@@ -1267,7 +1957,7 @@
           <w:color w:val="1F5FA8"/>
           <w:sz w:val="26"/>
         </w:rPr>
-        <w:t>Wat staat er op het bord</w:t>
+        <w:t>Wat staat er op het bord: scenario's</w:t>
       </w:r>
     </w:p>
     <w:p>
@@ -1405,17 +2095,30 @@
       <w:pPr>
         <w:pStyle w:val="Heading1"/>
         <w:pBdr>
-          <w:bottom w:val="single" w:sz="6" w:space="4" w:color="6B3FA0"/>
+          <w:bottom w:val="single" w:sz="6" w:space="4" w:color="1F5FA8"/>
         </w:pBdr>
         <w:spacing w:before="360" w:after="120"/>
       </w:pPr>
       <w:r>
         <w:rPr>
           <w:rFonts w:ascii="Calibri" w:hAnsi="Calibri"/>
-          <w:color w:val="6B3FA0"/>
+          <w:color w:val="1F5FA8"/>
           <w:sz w:val="34"/>
         </w:rPr>
-        <w:t>6. Twee grote wijzigingen en de analyse</w:t>
+        <w:t>7. Oud versus nieuw</w:t>
+      </w:r>
+    </w:p>
+    <w:p>
+      <w:pPr>
+        <w:spacing w:before="0" w:after="160"/>
+      </w:pPr>
+      <w:r>
+        <w:rPr>
+          <w:i/>
+          <w:color w:val="5A6472"/>
+          <w:sz w:val="18"/>
+        </w:rPr>
+        <w:t>Foto 12 - middendeel van het bord, bovenste helft</w:t>
       </w:r>
     </w:p>
     <w:p>
@@ -1429,7 +2132,7 @@
           <w:color w:val="1B2430"/>
           <w:sz w:val="21"/>
         </w:rPr>
-        <w:t>Het rechterdeel van het bord bevat de belangrijkste conclusie van de sessie: de twee wijzigingen zijn los van elkaar geanalyseerd, en ze vallen verschillend uit.</w:t>
+        <w:t>De kern van de verandering: waar de acute en intensieve zorg nu over vier plaatsen in het gebouw verdeeld is, komt die straks in twee clusters te liggen.</w:t>
       </w:r>
     </w:p>
     <w:p>
@@ -1440,8 +2143,8 @@
       <w:r>
         <w:drawing>
           <wp:inline xmlns:a="http://schemas.openxmlformats.org/drawingml/2006/main" xmlns:pic="http://schemas.openxmlformats.org/drawingml/2006/picture">
-            <wp:extent cx="5903999" cy="4681028"/>
-            <wp:docPr id="7" name="Picture 7"/>
+            <wp:extent cx="5903999" cy="4006285"/>
+            <wp:docPr id="8" name="Picture 8"/>
             <wp:cNvGraphicFramePr>
               <a:graphicFrameLocks noChangeAspect="1"/>
             </wp:cNvGraphicFramePr>
@@ -1449,11 +2152,11 @@
               <a:graphicData uri="http://schemas.openxmlformats.org/drawingml/2006/picture">
                 <pic:pic>
                   <pic:nvPicPr>
-                    <pic:cNvPr id="0" name="fig07_wijzigingen.png"/>
+                    <pic:cNvPr id="0" name="fig04_oud_nieuw.png"/>
                     <pic:cNvPicPr/>
                   </pic:nvPicPr>
                   <pic:blipFill>
-                    <a:blip r:embed="rId16"/>
+                    <a:blip r:embed="rId17"/>
                     <a:stretch>
                       <a:fillRect/>
                     </a:stretch>
@@ -1461,7 +2164,7 @@
                   <pic:spPr>
                     <a:xfrm>
                       <a:off x="0" y="0"/>
-                      <a:ext cx="5903999" cy="4681028"/>
+                      <a:ext cx="5903999" cy="4006285"/>
                     </a:xfrm>
                     <a:prstGeom prst="rect"/>
                   </pic:spPr>
@@ -1483,7 +2186,7 @@
           <w:color w:val="5A6472"/>
           <w:sz w:val="18"/>
         </w:rPr>
-        <w:t>Figuur 7 - Analyse van de acute poort en de Hotfloor, en de EHH-vraag die beide raakt</w:t>
+        <w:t>Figuur 8 - Van vier verspreide afdelingen naar acute poort en Hotfloor</w:t>
       </w:r>
     </w:p>
     <w:p>
@@ -1494,7 +2197,7 @@
       <w:r>
         <w:rPr>
           <w:rFonts w:ascii="Calibri" w:hAnsi="Calibri"/>
-          <w:color w:val="6B3FA0"/>
+          <w:color w:val="1F5FA8"/>
           <w:sz w:val="26"/>
         </w:rPr>
         <w:t>Wat staat er op het bord</w:t>
@@ -1510,7 +2213,7 @@
           <w:color w:val="1B2430"/>
           <w:sz w:val="21"/>
         </w:rPr>
-        <w:t>Wijziging 1: acute poort - drie stromen worden één poort.</w:t>
+        <w:t>Oud: kind spoed bij de kinderafdeling/poli, SEH op de begane grond, ICU op de 2e verdieping, CCU/SCU/EHH op de 1e verdieping.</w:t>
       </w:r>
     </w:p>
     <w:p>
@@ -1523,7 +2226,7 @@
           <w:color w:val="1B2430"/>
           <w:sz w:val="21"/>
         </w:rPr>
-        <w:t>Wijziging 2: Hotfloor - ICU, CCU en SCU samen.</w:t>
+        <w:t>Nieuw 1: SEH met acute poort, met daarin kind, EHH en SEH.</w:t>
       </w:r>
     </w:p>
     <w:p>
@@ -1536,7 +2239,7 @@
           <w:color w:val="1B2430"/>
           <w:sz w:val="21"/>
         </w:rPr>
-        <w:t>Analyse: één acute poort past niet voor kind, EHH en SEH samen.</w:t>
+        <w:t>Nieuw 2: Hotfloor, met daarin ICU en CCU/SCU.</w:t>
       </w:r>
     </w:p>
     <w:p>
@@ -1549,46 +2252,7 @@
           <w:color w:val="1B2430"/>
           <w:sz w:val="21"/>
         </w:rPr>
-        <w:t>Vervolg: analyse op dag- en uurniveau, jaarpatroon, data is beschikbaar, vervolgactie bepalen.</w:t>
-      </w:r>
-    </w:p>
-    <w:p>
-      <w:pPr>
-        <w:pStyle w:val="ListBullet"/>
-        <w:spacing w:after="60" w:line="288" w:lineRule="auto"/>
-      </w:pPr>
-      <w:r>
-        <w:rPr>
-          <w:color w:val="1B2430"/>
-          <w:sz w:val="21"/>
-        </w:rPr>
-        <w:t>Doel: de zorg past fysiek op de nieuwe SEH.</w:t>
-      </w:r>
-    </w:p>
-    <w:p>
-      <w:pPr>
-        <w:pStyle w:val="ListBullet"/>
-        <w:spacing w:after="60" w:line="288" w:lineRule="auto"/>
-      </w:pPr>
-      <w:r>
-        <w:rPr>
-          <w:color w:val="1B2430"/>
-          <w:sz w:val="21"/>
-        </w:rPr>
-        <w:t>Analyse: Hotfloor op 16 bedden past wél. Openstaand: weigeringskans en de vraag of de EHH apart komt.</w:t>
-      </w:r>
-    </w:p>
-    <w:p>
-      <w:pPr>
-        <w:pStyle w:val="ListBullet"/>
-        <w:spacing w:after="60" w:line="288" w:lineRule="auto"/>
-      </w:pPr>
-      <w:r>
-        <w:rPr>
-          <w:color w:val="1B2430"/>
-          <w:sz w:val="21"/>
-        </w:rPr>
-        <w:t>Waar valt de EHH onder - bij 1 of bij 2? Daaruit volgen analyse, knelpunten en acties.</w:t>
+        <w:t>Fysieke plekken: hoeveel plekken zijn er nodig? En zijn dit er 16?</w:t>
       </w:r>
     </w:p>
     <w:p>
@@ -1596,21 +2260,93 @@
         <w:br w:type="page"/>
       </w:r>
     </w:p>
+    <w:tbl>
+      <w:tblPr>
+        <w:tblW w:type="auto" w:w="0"/>
+        <w:jc w:val="center"/>
+        <w:tblBorders>
+          <w:top w:val="single" w:sz="4" w:space="0" w:color="6B3FA0"/>
+          <w:left w:val="single" w:sz="4" w:space="0" w:color="6B3FA0"/>
+          <w:bottom w:val="single" w:sz="4" w:space="0" w:color="6B3FA0"/>
+          <w:right w:val="single" w:sz="4" w:space="0" w:color="6B3FA0"/>
+          <w:insideH w:val="single" w:sz="4" w:space="0" w:color="6B3FA0"/>
+          <w:insideV w:val="single" w:sz="4" w:space="0" w:color="6B3FA0"/>
+        </w:tblBorders>
+        <w:tblLook w:firstColumn="1" w:firstRow="1" w:lastColumn="0" w:lastRow="0" w:noHBand="0" w:noVBand="1" w:val="04A0"/>
+      </w:tblPr>
+      <w:tblGrid>
+        <w:gridCol w:w="9298"/>
+      </w:tblGrid>
+      <w:tr>
+        <w:tc>
+          <w:tcPr>
+            <w:tcW w:type="dxa" w:w="9298"/>
+            <w:shd w:val="clear" w:color="auto" w:fill="6B3FA0"/>
+          </w:tcPr>
+          <w:p>
+            <w:pPr>
+              <w:spacing w:before="120" w:after="40"/>
+              <w:jc w:val="center"/>
+            </w:pPr>
+            <w:r>
+              <w:rPr>
+                <w:b/>
+                <w:color w:val="FFFFFF"/>
+                <w:sz w:val="22"/>
+              </w:rPr>
+              <w:t>DEEL B</w:t>
+            </w:r>
+          </w:p>
+          <w:p>
+            <w:pPr>
+              <w:spacing w:after="120"/>
+              <w:jc w:val="center"/>
+            </w:pPr>
+            <w:r>
+              <w:rPr>
+                <w:b/>
+                <w:color w:val="FFFFFF"/>
+                <w:sz w:val="32"/>
+              </w:rPr>
+              <w:t>Het capaciteitsbord</w:t>
+            </w:r>
+          </w:p>
+        </w:tc>
+      </w:tr>
+    </w:tbl>
+    <w:p>
+      <w:pPr>
+        <w:spacing w:after="40"/>
+      </w:pPr>
+    </w:p>
     <w:p>
       <w:pPr>
         <w:pStyle w:val="Heading1"/>
         <w:pBdr>
-          <w:bottom w:val="single" w:sz="6" w:space="4" w:color="1F5FA8"/>
+          <w:bottom w:val="single" w:sz="6" w:space="4" w:color="6B3FA0"/>
         </w:pBdr>
         <w:spacing w:before="360" w:after="120"/>
       </w:pPr>
       <w:r>
         <w:rPr>
           <w:rFonts w:ascii="Calibri" w:hAnsi="Calibri"/>
-          <w:color w:val="1F5FA8"/>
+          <w:color w:val="6B3FA0"/>
           <w:sz w:val="34"/>
         </w:rPr>
-        <w:t>7. Patiëntstromen per afdeling</w:t>
+        <w:t>8. Tijdlijn, berekeningen en patiëntstromen</w:t>
+      </w:r>
+    </w:p>
+    <w:p>
+      <w:pPr>
+        <w:spacing w:before="0" w:after="160"/>
+      </w:pPr>
+      <w:r>
+        <w:rPr>
+          <w:i/>
+          <w:color w:val="5A6472"/>
+          <w:sz w:val="18"/>
+        </w:rPr>
+        <w:t>Foto 15 - onderste helft van het capaciteitsbord</w:t>
       </w:r>
     </w:p>
     <w:p>
@@ -1624,7 +2360,140 @@
           <w:color w:val="1B2430"/>
           <w:sz w:val="21"/>
         </w:rPr>
-        <w:t>Om het aantal bedden te kunnen berekenen, is per afdeling uitgesplitst welke patiëntstromen erin zitten.</w:t>
+        <w:t>Op de tijdlijn staat wat er tussen september 2026 en de verhuizing gereed moet zijn. De maanden oktober tot en met mei zijn op het bord omkaderd: dat is de periode waarin de voorbereiding en het werken in de oudbouw plaatsvinden.</w:t>
+      </w:r>
+    </w:p>
+    <w:p>
+      <w:pPr>
+        <w:spacing w:before="120" w:after="40"/>
+        <w:jc w:val="center"/>
+      </w:pPr>
+      <w:r>
+        <w:drawing>
+          <wp:inline xmlns:a="http://schemas.openxmlformats.org/drawingml/2006/main" xmlns:pic="http://schemas.openxmlformats.org/drawingml/2006/picture">
+            <wp:extent cx="5903999" cy="3795428"/>
+            <wp:docPr id="9" name="Picture 9"/>
+            <wp:cNvGraphicFramePr>
+              <a:graphicFrameLocks noChangeAspect="1"/>
+            </wp:cNvGraphicFramePr>
+            <a:graphic>
+              <a:graphicData uri="http://schemas.openxmlformats.org/drawingml/2006/picture">
+                <pic:pic>
+                  <pic:nvPicPr>
+                    <pic:cNvPr id="0" name="fig03_tijdlijn.png"/>
+                    <pic:cNvPicPr/>
+                  </pic:nvPicPr>
+                  <pic:blipFill>
+                    <a:blip r:embed="rId18"/>
+                    <a:stretch>
+                      <a:fillRect/>
+                    </a:stretch>
+                  </pic:blipFill>
+                  <pic:spPr>
+                    <a:xfrm>
+                      <a:off x="0" y="0"/>
+                      <a:ext cx="5903999" cy="3795428"/>
+                    </a:xfrm>
+                    <a:prstGeom prst="rect"/>
+                  </pic:spPr>
+                </pic:pic>
+              </a:graphicData>
+            </a:graphic>
+          </wp:inline>
+        </w:drawing>
+      </w:r>
+    </w:p>
+    <w:p>
+      <w:pPr>
+        <w:spacing w:after="240"/>
+        <w:jc w:val="center"/>
+      </w:pPr>
+      <w:r>
+        <w:rPr>
+          <w:i/>
+          <w:color w:val="5A6472"/>
+          <w:sz w:val="18"/>
+        </w:rPr>
+        <w:t>Figuur 9 - Tijdlijn van september tot de verhuizing en de drie berekeningen</w:t>
+      </w:r>
+    </w:p>
+    <w:p>
+      <w:pPr>
+        <w:pStyle w:val="Heading2"/>
+        <w:spacing w:before="240" w:after="120"/>
+      </w:pPr>
+      <w:r>
+        <w:rPr>
+          <w:rFonts w:ascii="Calibri" w:hAnsi="Calibri"/>
+          <w:color w:val="6B3FA0"/>
+          <w:sz w:val="26"/>
+        </w:rPr>
+        <w:t>Wat staat er op het bord: tijdlijn</w:t>
+      </w:r>
+    </w:p>
+    <w:p>
+      <w:pPr>
+        <w:pStyle w:val="ListBullet"/>
+        <w:spacing w:after="60" w:line="288" w:lineRule="auto"/>
+      </w:pPr>
+      <w:r>
+        <w:rPr>
+          <w:color w:val="1B2430"/>
+          <w:sz w:val="21"/>
+        </w:rPr>
+        <w:t>September 2026: start van de berekeningen.</w:t>
+      </w:r>
+    </w:p>
+    <w:p>
+      <w:pPr>
+        <w:pStyle w:val="ListBullet"/>
+        <w:spacing w:after="60" w:line="288" w:lineRule="auto"/>
+      </w:pPr>
+      <w:r>
+        <w:rPr>
+          <w:color w:val="1B2430"/>
+          <w:sz w:val="21"/>
+        </w:rPr>
+        <w:t>Aantal bedden op basis van patiëntaanwezigheid gereed.</w:t>
+      </w:r>
+    </w:p>
+    <w:p>
+      <w:pPr>
+        <w:pStyle w:val="ListBullet"/>
+        <w:spacing w:after="60" w:line="288" w:lineRule="auto"/>
+      </w:pPr>
+      <w:r>
+        <w:rPr>
+          <w:color w:val="1B2430"/>
+          <w:sz w:val="21"/>
+        </w:rPr>
+        <w:t>Norm verpleegkundigen patiëntenzorg gereed, uitgesplitst naar D, L en N.</w:t>
+      </w:r>
+    </w:p>
+    <w:p>
+      <w:pPr>
+        <w:pStyle w:val="ListBullet"/>
+        <w:spacing w:after="60" w:line="288" w:lineRule="auto"/>
+      </w:pPr>
+      <w:r>
+        <w:rPr>
+          <w:color w:val="1B2430"/>
+          <w:sz w:val="21"/>
+        </w:rPr>
+        <w:t>Indirecte uren per afdeling gereed.</w:t>
+      </w:r>
+    </w:p>
+    <w:p>
+      <w:pPr>
+        <w:pStyle w:val="ListBullet"/>
+        <w:spacing w:after="60" w:line="288" w:lineRule="auto"/>
+      </w:pPr>
+      <w:r>
+        <w:rPr>
+          <w:color w:val="1B2430"/>
+          <w:sz w:val="21"/>
+        </w:rPr>
+        <w:t>Juni: verhuizing.</w:t>
       </w:r>
     </w:p>
     <w:p>
@@ -1636,7 +2505,7 @@
         <w:drawing>
           <wp:inline xmlns:a="http://schemas.openxmlformats.org/drawingml/2006/main" xmlns:pic="http://schemas.openxmlformats.org/drawingml/2006/picture">
             <wp:extent cx="5903999" cy="3415885"/>
-            <wp:docPr id="8" name="Picture 8"/>
+            <wp:docPr id="10" name="Picture 10"/>
             <wp:cNvGraphicFramePr>
               <a:graphicFrameLocks noChangeAspect="1"/>
             </wp:cNvGraphicFramePr>
@@ -1648,7 +2517,7 @@
                     <pic:cNvPicPr/>
                   </pic:nvPicPr>
                   <pic:blipFill>
-                    <a:blip r:embed="rId17"/>
+                    <a:blip r:embed="rId19"/>
                     <a:stretch>
                       <a:fillRect/>
                     </a:stretch>
@@ -1678,7 +2547,7 @@
           <w:color w:val="5A6472"/>
           <w:sz w:val="18"/>
         </w:rPr>
-        <w:t>Figuur 8 - Patiëntstromen die in de berekening meegenomen worden</w:t>
+        <w:t>Figuur 10 - Patiëntstromen die in de berekening meegenomen worden</w:t>
       </w:r>
     </w:p>
     <w:p>
@@ -1689,10 +2558,10 @@
       <w:r>
         <w:rPr>
           <w:rFonts w:ascii="Calibri" w:hAnsi="Calibri"/>
-          <w:color w:val="1F5FA8"/>
+          <w:color w:val="6B3FA0"/>
           <w:sz w:val="26"/>
         </w:rPr>
-        <w:t>Wat staat er op het bord</w:t>
+        <w:t>Wat staat er op het bord: patiëntstromen</w:t>
       </w:r>
     </w:p>
     <w:p>
@@ -1769,17 +2638,30 @@
       <w:pPr>
         <w:pStyle w:val="Heading1"/>
         <w:pBdr>
-          <w:bottom w:val="single" w:sz="6" w:space="4" w:color="1F5FA8"/>
+          <w:bottom w:val="single" w:sz="6" w:space="4" w:color="0E9A87"/>
         </w:pBdr>
         <w:spacing w:before="360" w:after="120"/>
       </w:pPr>
       <w:r>
         <w:rPr>
           <w:rFonts w:ascii="Calibri" w:hAnsi="Calibri"/>
-          <w:color w:val="1F5FA8"/>
+          <w:color w:val="0E9A87"/>
           <w:sz w:val="34"/>
         </w:rPr>
-        <w:t>8. Stand van zaken per afdeling</w:t>
+        <w:t>9. Plattegrond nieuwbouw en fysieke plekken</w:t>
+      </w:r>
+    </w:p>
+    <w:p>
+      <w:pPr>
+        <w:spacing w:before="0" w:after="160"/>
+      </w:pPr>
+      <w:r>
+        <w:rPr>
+          <w:i/>
+          <w:color w:val="5A6472"/>
+          <w:sz w:val="18"/>
+        </w:rPr>
+        <w:t>Foto 14 - rechterdeel van het capaciteitsbord</w:t>
       </w:r>
     </w:p>
     <w:p>
@@ -1793,7 +2675,329 @@
           <w:color w:val="1B2430"/>
           <w:sz w:val="21"/>
         </w:rPr>
-        <w:t>De tabel linksboven op het bord laat zien dat de basis nog grotendeels ontbreekt: op één afdeling na is er geen jaarplan ingevoerd, en er is voor geen enkele afdeling een vastgestelde norm verpleegkundigen.</w:t>
+        <w:t>De plattegrond van de nieuwbouw kent drie ruimtes. Alleen voor de Hotfloor staat het aantal plekken vast; voor de SEH en de EHH staat er nog een vraagteken.</w:t>
+      </w:r>
+    </w:p>
+    <w:p>
+      <w:pPr>
+        <w:spacing w:before="120" w:after="40"/>
+        <w:jc w:val="center"/>
+      </w:pPr>
+      <w:r>
+        <w:drawing>
+          <wp:inline xmlns:a="http://schemas.openxmlformats.org/drawingml/2006/main" xmlns:pic="http://schemas.openxmlformats.org/drawingml/2006/picture">
+            <wp:extent cx="5903999" cy="3626742"/>
+            <wp:docPr id="11" name="Picture 11"/>
+            <wp:cNvGraphicFramePr>
+              <a:graphicFrameLocks noChangeAspect="1"/>
+            </wp:cNvGraphicFramePr>
+            <a:graphic>
+              <a:graphicData uri="http://schemas.openxmlformats.org/drawingml/2006/picture">
+                <pic:pic>
+                  <pic:nvPicPr>
+                    <pic:cNvPr id="0" name="fig05_plattegrond.png"/>
+                    <pic:cNvPicPr/>
+                  </pic:nvPicPr>
+                  <pic:blipFill>
+                    <a:blip r:embed="rId20"/>
+                    <a:stretch>
+                      <a:fillRect/>
+                    </a:stretch>
+                  </pic:blipFill>
+                  <pic:spPr>
+                    <a:xfrm>
+                      <a:off x="0" y="0"/>
+                      <a:ext cx="5903999" cy="3626742"/>
+                    </a:xfrm>
+                    <a:prstGeom prst="rect"/>
+                  </pic:spPr>
+                </pic:pic>
+              </a:graphicData>
+            </a:graphic>
+          </wp:inline>
+        </w:drawing>
+      </w:r>
+    </w:p>
+    <w:p>
+      <w:pPr>
+        <w:spacing w:after="240"/>
+        <w:jc w:val="center"/>
+      </w:pPr>
+      <w:r>
+        <w:rPr>
+          <w:i/>
+          <w:color w:val="5A6472"/>
+          <w:sz w:val="18"/>
+        </w:rPr>
+        <w:t>Figuur 11 - Plattegrond, aantallen en wat er per plek uitgeschreven moet worden</w:t>
+      </w:r>
+    </w:p>
+    <w:p>
+      <w:pPr>
+        <w:pStyle w:val="Heading2"/>
+        <w:spacing w:before="240" w:after="120"/>
+      </w:pPr>
+      <w:r>
+        <w:rPr>
+          <w:rFonts w:ascii="Calibri" w:hAnsi="Calibri"/>
+          <w:color w:val="0E9A87"/>
+          <w:sz w:val="26"/>
+        </w:rPr>
+        <w:t>Wat staat er op het bord</w:t>
+      </w:r>
+    </w:p>
+    <w:p>
+      <w:pPr>
+        <w:pStyle w:val="ListBullet"/>
+        <w:spacing w:after="60" w:line="288" w:lineRule="auto"/>
+      </w:pPr>
+      <w:r>
+        <w:rPr>
+          <w:color w:val="1B2430"/>
+          <w:sz w:val="21"/>
+        </w:rPr>
+        <w:t>Scenario nieuwbouw fysiek: Hotfloor = 16 bedden, SEH = ? plekken, EHH = ? plekken.</w:t>
+      </w:r>
+    </w:p>
+    <w:p>
+      <w:pPr>
+        <w:pStyle w:val="ListBullet"/>
+        <w:spacing w:after="60" w:line="288" w:lineRule="auto"/>
+      </w:pPr>
+      <w:r>
+        <w:rPr>
+          <w:color w:val="1B2430"/>
+          <w:sz w:val="21"/>
+        </w:rPr>
+        <w:t>Fysieke plekken uitschrijven aan de hand van kamernummer en type, eventueel met middelen en materialen.</w:t>
+      </w:r>
+    </w:p>
+    <w:p>
+      <w:pPr>
+        <w:pStyle w:val="ListBullet"/>
+        <w:spacing w:after="60" w:line="288" w:lineRule="auto"/>
+      </w:pPr>
+      <w:r>
+        <w:rPr>
+          <w:color w:val="1B2430"/>
+          <w:sz w:val="21"/>
+        </w:rPr>
+        <w:t>Onderscheid tussen fysieke plekken, specifieke plekken en middelen/materialen/apparatuur.</w:t>
+      </w:r>
+    </w:p>
+    <w:p>
+      <w:pPr>
+        <w:pStyle w:val="ListBullet"/>
+        <w:spacing w:after="60" w:line="288" w:lineRule="auto"/>
+      </w:pPr>
+      <w:r>
+        <w:rPr>
+          <w:color w:val="1B2430"/>
+          <w:sz w:val="21"/>
+        </w:rPr>
+        <w:t>Bijvoorbeeld: kan er overal beademd worden?</w:t>
+      </w:r>
+    </w:p>
+    <w:p>
+      <w:pPr>
+        <w:pStyle w:val="ListBullet"/>
+        <w:spacing w:after="60" w:line="288" w:lineRule="auto"/>
+      </w:pPr>
+      <w:r>
+        <w:rPr>
+          <w:color w:val="1B2430"/>
+          <w:sz w:val="21"/>
+        </w:rPr>
+        <w:t>Kan elke zorgvraag in elke kamer?</w:t>
+      </w:r>
+    </w:p>
+    <w:p>
+      <w:pPr>
+        <w:pStyle w:val="ListBullet"/>
+        <w:spacing w:after="60" w:line="288" w:lineRule="auto"/>
+      </w:pPr>
+      <w:r>
+        <w:rPr>
+          <w:color w:val="1B2430"/>
+          <w:sz w:val="21"/>
+        </w:rPr>
+        <w:t>Is er een basisverdeling fysiek voor ICU, CCU en SCU?</w:t>
+      </w:r>
+    </w:p>
+    <w:p>
+      <w:r>
+        <w:br w:type="page"/>
+      </w:r>
+    </w:p>
+    <w:tbl>
+      <w:tblPr>
+        <w:tblW w:type="auto" w:w="0"/>
+        <w:jc w:val="center"/>
+        <w:tblBorders>
+          <w:top w:val="single" w:sz="4" w:space="0" w:color="0E9A87"/>
+          <w:left w:val="single" w:sz="4" w:space="0" w:color="0E9A87"/>
+          <w:bottom w:val="single" w:sz="4" w:space="0" w:color="0E9A87"/>
+          <w:right w:val="single" w:sz="4" w:space="0" w:color="0E9A87"/>
+          <w:insideH w:val="single" w:sz="4" w:space="0" w:color="0E9A87"/>
+          <w:insideV w:val="single" w:sz="4" w:space="0" w:color="0E9A87"/>
+        </w:tblBorders>
+        <w:tblLook w:firstColumn="1" w:firstRow="1" w:lastColumn="0" w:lastRow="0" w:noHBand="0" w:noVBand="1" w:val="04A0"/>
+      </w:tblPr>
+      <w:tblGrid>
+        <w:gridCol w:w="9298"/>
+      </w:tblGrid>
+      <w:tr>
+        <w:tc>
+          <w:tcPr>
+            <w:tcW w:type="dxa" w:w="9298"/>
+            <w:shd w:val="clear" w:color="auto" w:fill="0E9A87"/>
+          </w:tcPr>
+          <w:p>
+            <w:pPr>
+              <w:spacing w:before="120" w:after="40"/>
+              <w:jc w:val="center"/>
+            </w:pPr>
+            <w:r>
+              <w:rPr>
+                <w:b/>
+                <w:color w:val="FFFFFF"/>
+                <w:sz w:val="22"/>
+              </w:rPr>
+              <w:t>DEEL C</w:t>
+            </w:r>
+          </w:p>
+          <w:p>
+            <w:pPr>
+              <w:spacing w:after="120"/>
+              <w:jc w:val="center"/>
+            </w:pPr>
+            <w:r>
+              <w:rPr>
+                <w:b/>
+                <w:color w:val="FFFFFF"/>
+                <w:sz w:val="32"/>
+              </w:rPr>
+              <w:t>Totaaloverzicht</w:t>
+            </w:r>
+          </w:p>
+        </w:tc>
+      </w:tr>
+    </w:tbl>
+    <w:p>
+      <w:pPr>
+        <w:spacing w:after="40"/>
+      </w:pPr>
+    </w:p>
+    <w:p>
+      <w:pPr>
+        <w:pStyle w:val="Heading1"/>
+        <w:pBdr>
+          <w:bottom w:val="single" w:sz="6" w:space="4" w:color="1F5FA8"/>
+        </w:pBdr>
+        <w:spacing w:before="360" w:after="120"/>
+      </w:pPr>
+      <w:r>
+        <w:rPr>
+          <w:rFonts w:ascii="Calibri" w:hAnsi="Calibri"/>
+          <w:color w:val="1F5FA8"/>
+          <w:sz w:val="34"/>
+        </w:rPr>
+        <w:t>10. Totaaloverzicht en stand van zaken per afdeling</w:t>
+      </w:r>
+    </w:p>
+    <w:p>
+      <w:pPr>
+        <w:spacing w:before="0" w:after="160"/>
+      </w:pPr>
+      <w:r>
+        <w:rPr>
+          <w:i/>
+          <w:color w:val="5A6472"/>
+          <w:sz w:val="18"/>
+        </w:rPr>
+        <w:t>Foto 16 - het capaciteitsbord in een opname</w:t>
+      </w:r>
+    </w:p>
+    <w:p>
+      <w:pPr>
+        <w:spacing w:before="0" w:after="120" w:line="300" w:lineRule="auto"/>
+      </w:pPr>
+      <w:r>
+        <w:rPr>
+          <w:b w:val="0"/>
+          <w:i w:val="0"/>
+          <w:color w:val="1B2430"/>
+          <w:sz w:val="21"/>
+        </w:rPr>
+        <w:t>Het capaciteitsbord in zijn geheel. Bovenaan staat de tabel met de stand van zaken per afdeling; die laat zien dat de basis nog grotendeels ontbreekt. Op één afdeling na is er geen jaarplan ingevoerd, en er is voor geen enkele afdeling een vastgestelde norm verpleegkundigen.</w:t>
+      </w:r>
+    </w:p>
+    <w:p>
+      <w:pPr>
+        <w:spacing w:before="120" w:after="40"/>
+        <w:jc w:val="center"/>
+      </w:pPr>
+      <w:r>
+        <w:drawing>
+          <wp:inline xmlns:a="http://schemas.openxmlformats.org/drawingml/2006/main" xmlns:pic="http://schemas.openxmlformats.org/drawingml/2006/picture">
+            <wp:extent cx="5903999" cy="4132799"/>
+            <wp:docPr id="12" name="Picture 12"/>
+            <wp:cNvGraphicFramePr>
+              <a:graphicFrameLocks noChangeAspect="1"/>
+            </wp:cNvGraphicFramePr>
+            <a:graphic>
+              <a:graphicData uri="http://schemas.openxmlformats.org/drawingml/2006/picture">
+                <pic:pic>
+                  <pic:nvPicPr>
+                    <pic:cNvPr id="0" name="fig_capaciteitsbord.png"/>
+                    <pic:cNvPicPr/>
+                  </pic:nvPicPr>
+                  <pic:blipFill>
+                    <a:blip r:embed="rId21"/>
+                    <a:stretch>
+                      <a:fillRect/>
+                    </a:stretch>
+                  </pic:blipFill>
+                  <pic:spPr>
+                    <a:xfrm>
+                      <a:off x="0" y="0"/>
+                      <a:ext cx="5903999" cy="4132799"/>
+                    </a:xfrm>
+                    <a:prstGeom prst="rect"/>
+                  </pic:spPr>
+                </pic:pic>
+              </a:graphicData>
+            </a:graphic>
+          </wp:inline>
+        </w:drawing>
+      </w:r>
+    </w:p>
+    <w:p>
+      <w:pPr>
+        <w:spacing w:after="240"/>
+        <w:jc w:val="center"/>
+      </w:pPr>
+      <w:r>
+        <w:rPr>
+          <w:i/>
+          <w:color w:val="5A6472"/>
+          <w:sz w:val="18"/>
+        </w:rPr>
+        <w:t>Figuur 12 - Schematische kaart van het capaciteitsbord</w:t>
+      </w:r>
+    </w:p>
+    <w:p>
+      <w:pPr>
+        <w:pStyle w:val="Heading2"/>
+        <w:spacing w:before="240" w:after="120"/>
+      </w:pPr>
+      <w:r>
+        <w:rPr>
+          <w:rFonts w:ascii="Calibri" w:hAnsi="Calibri"/>
+          <w:color w:val="1F5FA8"/>
+          <w:sz w:val="26"/>
+        </w:rPr>
+        <w:t>Stand van zaken per afdeling</w:t>
       </w:r>
     </w:p>
     <w:tbl>
@@ -2487,531 +3691,6 @@
           <w:color w:val="D2691E"/>
           <w:sz w:val="34"/>
         </w:rPr>
-        <w:t>9. Openstaande vragen</w:t>
-      </w:r>
-    </w:p>
-    <w:p>
-      <w:pPr>
-        <w:spacing w:before="0" w:after="120" w:line="300" w:lineRule="auto"/>
-      </w:pPr>
-      <w:r>
-        <w:rPr>
-          <w:b w:val="0"/>
-          <w:i w:val="0"/>
-          <w:color w:val="1B2430"/>
-          <w:sz w:val="21"/>
-        </w:rPr>
-        <w:t>De openstaande vragen op het bord vallen uiteen in twee sporen: vragen over de fysieke planning en vragen over de personele inzet.</w:t>
-      </w:r>
-    </w:p>
-    <w:p>
-      <w:pPr>
-        <w:spacing w:before="120" w:after="40"/>
-        <w:jc w:val="center"/>
-      </w:pPr>
-      <w:r>
-        <w:drawing>
-          <wp:inline xmlns:a="http://schemas.openxmlformats.org/drawingml/2006/main" xmlns:pic="http://schemas.openxmlformats.org/drawingml/2006/picture">
-            <wp:extent cx="5903999" cy="3795428"/>
-            <wp:docPr id="9" name="Picture 9"/>
-            <wp:cNvGraphicFramePr>
-              <a:graphicFrameLocks noChangeAspect="1"/>
-            </wp:cNvGraphicFramePr>
-            <a:graphic>
-              <a:graphicData uri="http://schemas.openxmlformats.org/drawingml/2006/picture">
-                <pic:pic>
-                  <pic:nvPicPr>
-                    <pic:cNvPr id="0" name="fig09_vragen.png"/>
-                    <pic:cNvPicPr/>
-                  </pic:nvPicPr>
-                  <pic:blipFill>
-                    <a:blip r:embed="rId18"/>
-                    <a:stretch>
-                      <a:fillRect/>
-                    </a:stretch>
-                  </pic:blipFill>
-                  <pic:spPr>
-                    <a:xfrm>
-                      <a:off x="0" y="0"/>
-                      <a:ext cx="5903999" cy="3795428"/>
-                    </a:xfrm>
-                    <a:prstGeom prst="rect"/>
-                  </pic:spPr>
-                </pic:pic>
-              </a:graphicData>
-            </a:graphic>
-          </wp:inline>
-        </w:drawing>
-      </w:r>
-    </w:p>
-    <w:p>
-      <w:pPr>
-        <w:spacing w:after="240"/>
-        <w:jc w:val="center"/>
-      </w:pPr>
-      <w:r>
-        <w:rPr>
-          <w:i/>
-          <w:color w:val="5A6472"/>
-          <w:sz w:val="18"/>
-        </w:rPr>
-        <w:t>Figuur 9 - Openstaande vragen langs twee sporen</w:t>
-      </w:r>
-    </w:p>
-    <w:p>
-      <w:pPr>
-        <w:pStyle w:val="Heading2"/>
-        <w:spacing w:before="240" w:after="120"/>
-      </w:pPr>
-      <w:r>
-        <w:rPr>
-          <w:rFonts w:ascii="Calibri" w:hAnsi="Calibri"/>
-          <w:color w:val="1F5FA8"/>
-          <w:sz w:val="26"/>
-        </w:rPr>
-        <w:t>Fysieke planning</w:t>
-      </w:r>
-    </w:p>
-    <w:p>
-      <w:pPr>
-        <w:pStyle w:val="ListNumber"/>
-        <w:spacing w:after="60" w:line="288" w:lineRule="auto"/>
-      </w:pPr>
-      <w:r>
-        <w:rPr>
-          <w:color w:val="1B2430"/>
-          <w:sz w:val="21"/>
-        </w:rPr>
-        <w:t>Waar komt de recoverypatiënt in avond, nacht en weekend?</w:t>
-      </w:r>
-    </w:p>
-    <w:p>
-      <w:pPr>
-        <w:pStyle w:val="ListNumber"/>
-        <w:spacing w:after="60" w:line="288" w:lineRule="auto"/>
-      </w:pPr>
-      <w:r>
-        <w:rPr>
-          <w:color w:val="1B2430"/>
-          <w:sz w:val="21"/>
-        </w:rPr>
-        <w:t>Waar komt de cardioversie?</w:t>
-      </w:r>
-    </w:p>
-    <w:p>
-      <w:pPr>
-        <w:pStyle w:val="ListNumber"/>
-        <w:spacing w:after="60" w:line="288" w:lineRule="auto"/>
-      </w:pPr>
-      <w:r>
-        <w:rPr>
-          <w:color w:val="1B2430"/>
-          <w:sz w:val="21"/>
-        </w:rPr>
-        <w:t>Hoort de EHH bij de SEH of bij de Hotfloor?</w:t>
-      </w:r>
-    </w:p>
-    <w:p>
-      <w:pPr>
-        <w:pStyle w:val="ListNumber"/>
-        <w:spacing w:after="60" w:line="288" w:lineRule="auto"/>
-      </w:pPr>
-      <w:r>
-        <w:rPr>
-          <w:color w:val="1B2430"/>
-          <w:sz w:val="21"/>
-        </w:rPr>
-        <w:t>Komt de OSAS post-OK patiënt nog op de ICU?</w:t>
-      </w:r>
-    </w:p>
-    <w:p>
-      <w:pPr>
-        <w:pStyle w:val="Heading2"/>
-        <w:spacing w:before="240" w:after="120"/>
-      </w:pPr>
-      <w:r>
-        <w:rPr>
-          <w:rFonts w:ascii="Calibri" w:hAnsi="Calibri"/>
-          <w:color w:val="6B3FA0"/>
-          <w:sz w:val="26"/>
-        </w:rPr>
-        <w:t>Personele inzet en opleiden</w:t>
-      </w:r>
-    </w:p>
-    <w:p>
-      <w:pPr>
-        <w:pStyle w:val="ListNumber"/>
-        <w:spacing w:after="60" w:line="288" w:lineRule="auto"/>
-      </w:pPr>
-      <w:r>
-        <w:rPr>
-          <w:color w:val="1B2430"/>
-          <w:sz w:val="21"/>
-        </w:rPr>
-        <w:t>Wat gebeurt er met de scopedienst van de CCU?</w:t>
-      </w:r>
-    </w:p>
-    <w:p>
-      <w:pPr>
-        <w:pStyle w:val="ListNumber"/>
-        <w:spacing w:after="60" w:line="288" w:lineRule="auto"/>
-      </w:pPr>
-      <w:r>
-        <w:rPr>
-          <w:color w:val="1B2430"/>
-          <w:sz w:val="21"/>
-        </w:rPr>
-        <w:t>Welke norm geldt er voor de Hotfloor?</w:t>
-      </w:r>
-    </w:p>
-    <w:p>
-      <w:pPr>
-        <w:pStyle w:val="ListNumber"/>
-        <w:spacing w:after="60" w:line="288" w:lineRule="auto"/>
-      </w:pPr>
-      <w:r>
-        <w:rPr>
-          <w:color w:val="1B2430"/>
-          <w:sz w:val="21"/>
-        </w:rPr>
-        <w:t>Inzet van de kinderverpleegkundige op de SEH?</w:t>
-      </w:r>
-    </w:p>
-    <w:p>
-      <w:pPr>
-        <w:spacing w:before="0" w:after="120" w:line="300" w:lineRule="auto"/>
-      </w:pPr>
-    </w:p>
-    <w:tbl>
-      <w:tblPr>
-        <w:tblW w:type="auto" w:w="0"/>
-        <w:jc w:val="center"/>
-        <w:tblBorders>
-          <w:top w:val="single" w:sz="8" w:space="0" w:color="D2691E"/>
-          <w:left w:val="single" w:sz="8" w:space="0" w:color="D2691E"/>
-          <w:bottom w:val="single" w:sz="8" w:space="0" w:color="D2691E"/>
-          <w:right w:val="single" w:sz="8" w:space="0" w:color="D2691E"/>
-          <w:insideH w:val="single" w:sz="8" w:space="0" w:color="D2691E"/>
-          <w:insideV w:val="single" w:sz="8" w:space="0" w:color="D2691E"/>
-        </w:tblBorders>
-        <w:tblLook w:firstColumn="1" w:firstRow="1" w:lastColumn="0" w:lastRow="0" w:noHBand="0" w:noVBand="1" w:val="04A0"/>
-      </w:tblPr>
-      <w:tblGrid>
-        <w:gridCol w:w="9298"/>
-      </w:tblGrid>
-      <w:tr>
-        <w:tc>
-          <w:tcPr>
-            <w:tcW w:type="dxa" w:w="9298"/>
-            <w:shd w:val="clear" w:color="auto" w:fill="FBEEE3"/>
-          </w:tcPr>
-          <w:p>
-            <w:pPr>
-              <w:spacing w:after="80"/>
-            </w:pPr>
-            <w:r>
-              <w:rPr>
-                <w:b/>
-                <w:color w:val="D2691E"/>
-                <w:sz w:val="22"/>
-              </w:rPr>
-              <w:t>Actie</w:t>
-            </w:r>
-          </w:p>
-          <w:p>
-            <w:pPr>
-              <w:spacing w:after="40" w:line="288" w:lineRule="auto"/>
-            </w:pPr>
-            <w:r>
-              <w:rPr>
-                <w:color w:val="1B2430"/>
-                <w:sz w:val="20"/>
-              </w:rPr>
-              <w:t>Deze lijst aanvullen met de vragen van Lonneke en Maxim.</w:t>
-            </w:r>
-          </w:p>
-        </w:tc>
-      </w:tr>
-    </w:tbl>
-    <w:p>
-      <w:pPr>
-        <w:spacing w:after="80"/>
-      </w:pPr>
-    </w:p>
-    <w:p>
-      <w:r>
-        <w:br w:type="page"/>
-      </w:r>
-    </w:p>
-    <w:p>
-      <w:pPr>
-        <w:pStyle w:val="Heading1"/>
-        <w:pBdr>
-          <w:bottom w:val="single" w:sz="6" w:space="4" w:color="6B3FA0"/>
-        </w:pBdr>
-        <w:spacing w:before="360" w:after="120"/>
-      </w:pPr>
-      <w:r>
-        <w:rPr>
-          <w:rFonts w:ascii="Calibri" w:hAnsi="Calibri"/>
-          <w:color w:val="6B3FA0"/>
-          <w:sz w:val="34"/>
-        </w:rPr>
-        <w:t>10. Stappenplan</w:t>
-      </w:r>
-    </w:p>
-    <w:p>
-      <w:pPr>
-        <w:spacing w:before="0" w:after="120" w:line="300" w:lineRule="auto"/>
-      </w:pPr>
-      <w:r>
-        <w:rPr>
-          <w:b w:val="0"/>
-          <w:i w:val="0"/>
-          <w:color w:val="1B2430"/>
-          <w:sz w:val="21"/>
-        </w:rPr>
-        <w:t>Het stappenplan is de rode draad van het bord: het laat zien hoe je van een scenario komt tot een rooster dat klopt, en hoe je daarna blijft monitoren.</w:t>
-      </w:r>
-    </w:p>
-    <w:p>
-      <w:pPr>
-        <w:spacing w:before="120" w:after="40"/>
-        <w:jc w:val="center"/>
-      </w:pPr>
-      <w:r>
-        <w:drawing>
-          <wp:inline xmlns:a="http://schemas.openxmlformats.org/drawingml/2006/main" xmlns:pic="http://schemas.openxmlformats.org/drawingml/2006/picture">
-            <wp:extent cx="5903999" cy="4554514"/>
-            <wp:docPr id="10" name="Picture 10"/>
-            <wp:cNvGraphicFramePr>
-              <a:graphicFrameLocks noChangeAspect="1"/>
-            </wp:cNvGraphicFramePr>
-            <a:graphic>
-              <a:graphicData uri="http://schemas.openxmlformats.org/drawingml/2006/picture">
-                <pic:pic>
-                  <pic:nvPicPr>
-                    <pic:cNvPr id="0" name="fig10_stappenplan.png"/>
-                    <pic:cNvPicPr/>
-                  </pic:nvPicPr>
-                  <pic:blipFill>
-                    <a:blip r:embed="rId19"/>
-                    <a:stretch>
-                      <a:fillRect/>
-                    </a:stretch>
-                  </pic:blipFill>
-                  <pic:spPr>
-                    <a:xfrm>
-                      <a:off x="0" y="0"/>
-                      <a:ext cx="5903999" cy="4554514"/>
-                    </a:xfrm>
-                    <a:prstGeom prst="rect"/>
-                  </pic:spPr>
-                </pic:pic>
-              </a:graphicData>
-            </a:graphic>
-          </wp:inline>
-        </w:drawing>
-      </w:r>
-    </w:p>
-    <w:p>
-      <w:pPr>
-        <w:spacing w:after="240"/>
-        <w:jc w:val="center"/>
-      </w:pPr>
-      <w:r>
-        <w:rPr>
-          <w:i/>
-          <w:color w:val="5A6472"/>
-          <w:sz w:val="18"/>
-        </w:rPr>
-        <w:t>Figuur 10 - Stappenplan van scenario naar roostersleutel, planning en monitoring</w:t>
-      </w:r>
-    </w:p>
-    <w:p>
-      <w:pPr>
-        <w:pStyle w:val="Heading2"/>
-        <w:spacing w:before="240" w:after="120"/>
-      </w:pPr>
-      <w:r>
-        <w:rPr>
-          <w:rFonts w:ascii="Calibri" w:hAnsi="Calibri"/>
-          <w:color w:val="6B3FA0"/>
-          <w:sz w:val="26"/>
-        </w:rPr>
-        <w:t>De stappen</w:t>
-      </w:r>
-    </w:p>
-    <w:p>
-      <w:pPr>
-        <w:pStyle w:val="ListNumber"/>
-        <w:spacing w:after="60" w:line="288" w:lineRule="auto"/>
-      </w:pPr>
-      <w:r>
-        <w:rPr>
-          <w:color w:val="1B2430"/>
-          <w:sz w:val="21"/>
-        </w:rPr>
-        <w:t>Scenario's uitwerken.</w:t>
-      </w:r>
-    </w:p>
-    <w:p>
-      <w:pPr>
-        <w:pStyle w:val="ListNumber"/>
-        <w:spacing w:after="60" w:line="288" w:lineRule="auto"/>
-      </w:pPr>
-      <w:r>
-        <w:rPr>
-          <w:color w:val="1B2430"/>
-          <w:sz w:val="21"/>
-        </w:rPr>
-        <w:t>Keuze maken op basis van data uit BI.</w:t>
-      </w:r>
-    </w:p>
-    <w:p>
-      <w:pPr>
-        <w:pStyle w:val="ListNumber"/>
-        <w:spacing w:after="60" w:line="288" w:lineRule="auto"/>
-      </w:pPr>
-      <w:r>
-        <w:rPr>
-          <w:color w:val="1B2430"/>
-          <w:sz w:val="21"/>
-        </w:rPr>
-        <w:t>Uitwerken in een week- en dagplan.</w:t>
-      </w:r>
-    </w:p>
-    <w:p>
-      <w:pPr>
-        <w:pStyle w:val="ListNumber"/>
-        <w:spacing w:after="60" w:line="288" w:lineRule="auto"/>
-      </w:pPr>
-      <w:r>
-        <w:rPr>
-          <w:color w:val="1B2430"/>
-          <w:sz w:val="21"/>
-        </w:rPr>
-        <w:t>Verwerken in de roostersleutels.</w:t>
-      </w:r>
-    </w:p>
-    <w:p>
-      <w:pPr>
-        <w:pStyle w:val="ListNumber"/>
-        <w:spacing w:after="60" w:line="288" w:lineRule="auto"/>
-      </w:pPr>
-      <w:r>
-        <w:rPr>
-          <w:color w:val="1B2430"/>
-          <w:sz w:val="21"/>
-        </w:rPr>
-        <w:t>Planning CPP.</w:t>
-      </w:r>
-    </w:p>
-    <w:p>
-      <w:pPr>
-        <w:pStyle w:val="ListNumber"/>
-        <w:spacing w:after="60" w:line="288" w:lineRule="auto"/>
-      </w:pPr>
-      <w:r>
-        <w:rPr>
-          <w:color w:val="1B2430"/>
-          <w:sz w:val="21"/>
-        </w:rPr>
-        <w:t>Monitoring van instroom, stops en knelpunten, en monitoring van de urenoverzichten.</w:t>
-      </w:r>
-    </w:p>
-    <w:p>
-      <w:pPr>
-        <w:spacing w:before="0" w:after="120" w:line="300" w:lineRule="auto"/>
-      </w:pPr>
-    </w:p>
-    <w:tbl>
-      <w:tblPr>
-        <w:tblW w:type="auto" w:w="0"/>
-        <w:jc w:val="center"/>
-        <w:tblBorders>
-          <w:top w:val="single" w:sz="8" w:space="0" w:color="6B3FA0"/>
-          <w:left w:val="single" w:sz="8" w:space="0" w:color="6B3FA0"/>
-          <w:bottom w:val="single" w:sz="8" w:space="0" w:color="6B3FA0"/>
-          <w:right w:val="single" w:sz="8" w:space="0" w:color="6B3FA0"/>
-          <w:insideH w:val="single" w:sz="8" w:space="0" w:color="6B3FA0"/>
-          <w:insideV w:val="single" w:sz="8" w:space="0" w:color="6B3FA0"/>
-        </w:tblBorders>
-        <w:tblLook w:firstColumn="1" w:firstRow="1" w:lastColumn="0" w:lastRow="0" w:noHBand="0" w:noVBand="1" w:val="04A0"/>
-      </w:tblPr>
-      <w:tblGrid>
-        <w:gridCol w:w="9298"/>
-      </w:tblGrid>
-      <w:tr>
-        <w:tc>
-          <w:tcPr>
-            <w:tcW w:type="dxa" w:w="9298"/>
-            <w:shd w:val="clear" w:color="auto" w:fill="F0EAF8"/>
-          </w:tcPr>
-          <w:p>
-            <w:pPr>
-              <w:spacing w:after="80"/>
-            </w:pPr>
-            <w:r>
-              <w:rPr>
-                <w:b/>
-                <w:color w:val="6B3FA0"/>
-                <w:sz w:val="22"/>
-              </w:rPr>
-              <w:t>Twee uitgangspunten bij het stappenplan</w:t>
-            </w:r>
-          </w:p>
-          <w:p>
-            <w:pPr>
-              <w:spacing w:after="40" w:line="288" w:lineRule="auto"/>
-            </w:pPr>
-            <w:r>
-              <w:rPr>
-                <w:color w:val="1B2430"/>
-                <w:sz w:val="20"/>
-              </w:rPr>
-              <w:t>Fysiek gaat voor personeel: eerst wat en waar, daarna volgt de personele inzet daaruit.</w:t>
-            </w:r>
-          </w:p>
-          <w:p>
-            <w:pPr>
-              <w:spacing w:after="40" w:line="288" w:lineRule="auto"/>
-            </w:pPr>
-            <w:r>
-              <w:rPr>
-                <w:color w:val="1B2430"/>
-                <w:sz w:val="20"/>
-              </w:rPr>
-              <w:t>Scheiden in perioden: nu en heel 2026, oudbouw 2027, de verhuisperiode, en de nieuwbouw vanaf juni 2027.</w:t>
-            </w:r>
-          </w:p>
-        </w:tc>
-      </w:tr>
-    </w:tbl>
-    <w:p>
-      <w:pPr>
-        <w:spacing w:after="80"/>
-      </w:pPr>
-    </w:p>
-    <w:p>
-      <w:r>
-        <w:br w:type="page"/>
-      </w:r>
-    </w:p>
-    <w:p>
-      <w:pPr>
-        <w:pStyle w:val="Heading1"/>
-        <w:pBdr>
-          <w:bottom w:val="single" w:sz="6" w:space="4" w:color="D2691E"/>
-        </w:pBdr>
-        <w:spacing w:before="360" w:after="120"/>
-      </w:pPr>
-      <w:r>
-        <w:rPr>
-          <w:rFonts w:ascii="Calibri" w:hAnsi="Calibri"/>
-          <w:color w:val="D2691E"/>
-          <w:sz w:val="34"/>
-        </w:rPr>
         <w:t>11. Punten die op het bord niet eenduidig te lezen zijn</w:t>
       </w:r>
     </w:p>

</xml_diff>